<commit_message>
improve utah-bikeways ojs plot
</commit_message>
<xml_diff>
--- a/docs/posts/utah-bikeways/index.docx
+++ b/docs/posts/utah-bikeways/index.docx
@@ -9399,7 +9399,7 @@
         <w:rPr>
           <w:rStyle w:val="VerbatimChar"/>
         </w:rPr>
-        <w:t xml:space="preserve">// 1. Transpose data</w:t>
+        <w:t xml:space="preserve">// 1. Transpose data from R</w:t>
       </w:r>
       <w:r>
         <w:br/>
@@ -9420,7 +9420,7 @@
         <w:rPr>
           <w:rStyle w:val="VerbatimChar"/>
         </w:rPr>
-        <w:t xml:space="preserve">// 2. Create Inputs (No changes needed here)</w:t>
+        <w:t xml:space="preserve">// 2. Create Inputs</w:t>
       </w:r>
       <w:r>
         <w:br/>
@@ -9477,6 +9477,42 @@
         <w:rPr>
           <w:rStyle w:val="VerbatimChar"/>
         </w:rPr>
+        <w:t xml:space="preserve">  </w:t>
+      </w:r>
+      <w:r>
+        <w:br/>
+      </w:r>
+      <w:r>
+        <w:rPr>
+          <w:rStyle w:val="VerbatimChar"/>
+        </w:rPr>
+        <w:t xml:space="preserve">  // Calculate total bike miles for this row once to ensure consistency</w:t>
+      </w:r>
+      <w:r>
+        <w:br/>
+      </w:r>
+      <w:r>
+        <w:rPr>
+          <w:rStyle w:val="VerbatimChar"/>
+        </w:rPr>
+        <w:t xml:space="preserve">  const totalBike = types.reduce((sum, type) =&gt; sum + (d[type] || 0), 0);</w:t>
+      </w:r>
+      <w:r>
+        <w:br/>
+      </w:r>
+      <w:r>
+        <w:rPr>
+          <w:rStyle w:val="VerbatimChar"/>
+        </w:rPr>
+        <w:t xml:space="preserve">  </w:t>
+      </w:r>
+      <w:r>
+        <w:br/>
+      </w:r>
+      <w:r>
+        <w:rPr>
+          <w:rStyle w:val="VerbatimChar"/>
+        </w:rPr>
         <w:t xml:space="preserve">  return types.map(t =&gt; ({</w:t>
       </w:r>
       <w:r>
@@ -9486,16 +9522,16 @@
         <w:rPr>
           <w:rStyle w:val="VerbatimChar"/>
         </w:rPr>
-        <w:t xml:space="preserve">    // FIX: Fallback to "Unincorporated/Unknown" if Name is null/NA</w:t>
-      </w:r>
-      <w:r>
-        <w:br/>
-      </w:r>
-      <w:r>
-        <w:rPr>
-          <w:rStyle w:val="VerbatimChar"/>
-        </w:rPr>
-        <w:t xml:space="preserve">    City: d.Name || "Unincorporated",</w:t>
+        <w:t xml:space="preserve">    // SAFETY FIX: Handle null/NA names</w:t>
+      </w:r>
+      <w:r>
+        <w:br/>
+      </w:r>
+      <w:r>
+        <w:rPr>
+          <w:rStyle w:val="VerbatimChar"/>
+        </w:rPr>
+        <w:t xml:space="preserve">    City: d.Name || "Unincorporated", </w:t>
       </w:r>
       <w:r>
         <w:br/>
@@ -9522,7 +9558,7 @@
         <w:rPr>
           <w:rStyle w:val="VerbatimChar"/>
         </w:rPr>
-        <w:t xml:space="preserve">    TotalBike: types.reduce((sum, type) =&gt; sum + (d[type] || 0), 0),</w:t>
+        <w:t xml:space="preserve">    TotalBike: totalBike,</w:t>
       </w:r>
       <w:r>
         <w:br/>
@@ -9579,34 +9615,34 @@
         <w:rPr>
           <w:rStyle w:val="VerbatimChar"/>
         </w:rPr>
-        <w:t xml:space="preserve">  // FIX: Ensure d.City exists before calling .toLowerCase()</w:t>
-      </w:r>
-      <w:r>
-        <w:br/>
-      </w:r>
-      <w:r>
-        <w:rPr>
-          <w:rStyle w:val="VerbatimChar"/>
-        </w:rPr>
-        <w:t xml:space="preserve">  const nameMatch = d.City &amp;&amp; d.City.toLowerCase().includes(search.toLowerCase());</w:t>
-      </w:r>
-      <w:r>
-        <w:br/>
-      </w:r>
-      <w:r>
-        <w:rPr>
-          <w:rStyle w:val="VerbatimChar"/>
-        </w:rPr>
-        <w:t xml:space="preserve">  const mileMatch = d.TotalBike &gt;= minMiles;</w:t>
-      </w:r>
-      <w:r>
-        <w:br/>
-      </w:r>
-      <w:r>
-        <w:rPr>
-          <w:rStyle w:val="VerbatimChar"/>
-        </w:rPr>
-        <w:t xml:space="preserve">  return nameMatch &amp;&amp; mileMatch;</w:t>
+        <w:t xml:space="preserve">  const city = d.City ? d.City.toLowerCase() : "";</w:t>
+      </w:r>
+      <w:r>
+        <w:br/>
+      </w:r>
+      <w:r>
+        <w:rPr>
+          <w:rStyle w:val="VerbatimChar"/>
+        </w:rPr>
+        <w:t xml:space="preserve">  const query = search.toLowerCase();</w:t>
+      </w:r>
+      <w:r>
+        <w:br/>
+      </w:r>
+      <w:r>
+        <w:rPr>
+          <w:rStyle w:val="VerbatimChar"/>
+        </w:rPr>
+        <w:t xml:space="preserve">  // Filter by name AND minimum mileage threshold</w:t>
+      </w:r>
+      <w:r>
+        <w:br/>
+      </w:r>
+      <w:r>
+        <w:rPr>
+          <w:rStyle w:val="VerbatimChar"/>
+        </w:rPr>
+        <w:t xml:space="preserve">  return city.includes(query) &amp;&amp; d.TotalBike &gt;= minMiles;</w:t>
       </w:r>
       <w:r>
         <w:br/>
@@ -9627,7 +9663,7 @@
         <w:rPr>
           <w:rStyle w:val="VerbatimChar"/>
         </w:rPr>
-        <w:t xml:space="preserve">// 5. Render Plot</w:t>
+        <w:t xml:space="preserve">// 5. Render Aesthetic Plot</w:t>
       </w:r>
       <w:r>
         <w:br/>
@@ -9645,43 +9681,160 @@
         <w:rPr>
           <w:rStyle w:val="VerbatimChar"/>
         </w:rPr>
-        <w:t xml:space="preserve">  marginLeft: 140,</w:t>
-      </w:r>
-      <w:r>
-        <w:br/>
-      </w:r>
-      <w:r>
-        <w:rPr>
-          <w:rStyle w:val="VerbatimChar"/>
-        </w:rPr>
-        <w:t xml:space="preserve">  height: Math.max(400, new Set(filtered.map(d =&gt; d.City)).size * 20),</w:t>
-      </w:r>
-      <w:r>
-        <w:br/>
-      </w:r>
-      <w:r>
-        <w:rPr>
-          <w:rStyle w:val="VerbatimChar"/>
-        </w:rPr>
-        <w:t xml:space="preserve">  style: {fontSize: "12px"},</w:t>
-      </w:r>
-      <w:r>
-        <w:br/>
-      </w:r>
-      <w:r>
-        <w:rPr>
-          <w:rStyle w:val="VerbatimChar"/>
-        </w:rPr>
-        <w:t xml:space="preserve">  x: {label: "Miles", grid: true},</w:t>
-      </w:r>
-      <w:r>
-        <w:br/>
-      </w:r>
-      <w:r>
-        <w:rPr>
-          <w:rStyle w:val="VerbatimChar"/>
-        </w:rPr>
-        <w:t xml:space="preserve">  y: {label: null},</w:t>
+        <w:t xml:space="preserve">  title: "Bikeway Infrastructure by Municipality",</w:t>
+      </w:r>
+      <w:r>
+        <w:br/>
+      </w:r>
+      <w:r>
+        <w:rPr>
+          <w:rStyle w:val="VerbatimChar"/>
+        </w:rPr>
+        <w:t xml:space="preserve">  subtitle: "Comparing miles of separated paths, lanes, and routes. Black markers indicate total road miles.",</w:t>
+      </w:r>
+      <w:r>
+        <w:br/>
+      </w:r>
+      <w:r>
+        <w:rPr>
+          <w:rStyle w:val="VerbatimChar"/>
+        </w:rPr>
+        <w:t xml:space="preserve">  marginLeft: 160, // Extra space for city names</w:t>
+      </w:r>
+      <w:r>
+        <w:br/>
+      </w:r>
+      <w:r>
+        <w:rPr>
+          <w:rStyle w:val="VerbatimChar"/>
+        </w:rPr>
+        <w:t xml:space="preserve">  height: Math.max(400, new Set(filtered.map(d =&gt; d.City)).size * 22), // Dynamic height based on row count</w:t>
+      </w:r>
+      <w:r>
+        <w:br/>
+      </w:r>
+      <w:r>
+        <w:rPr>
+          <w:rStyle w:val="VerbatimChar"/>
+        </w:rPr>
+        <w:t xml:space="preserve">  style: {</w:t>
+      </w:r>
+      <w:r>
+        <w:br/>
+      </w:r>
+      <w:r>
+        <w:rPr>
+          <w:rStyle w:val="VerbatimChar"/>
+        </w:rPr>
+        <w:t xml:space="preserve">    fontSize: "13px",</w:t>
+      </w:r>
+      <w:r>
+        <w:br/>
+      </w:r>
+      <w:r>
+        <w:rPr>
+          <w:rStyle w:val="VerbatimChar"/>
+        </w:rPr>
+        <w:t xml:space="preserve">    fontFamily: "system-ui, sans-serif"</w:t>
+      </w:r>
+      <w:r>
+        <w:br/>
+      </w:r>
+      <w:r>
+        <w:rPr>
+          <w:rStyle w:val="VerbatimChar"/>
+        </w:rPr>
+        <w:t xml:space="preserve">  },</w:t>
+      </w:r>
+      <w:r>
+        <w:br/>
+      </w:r>
+      <w:r>
+        <w:rPr>
+          <w:rStyle w:val="VerbatimChar"/>
+        </w:rPr>
+        <w:t xml:space="preserve">  x: {</w:t>
+      </w:r>
+      <w:r>
+        <w:br/>
+      </w:r>
+      <w:r>
+        <w:rPr>
+          <w:rStyle w:val="VerbatimChar"/>
+        </w:rPr>
+        <w:t xml:space="preserve">    label: "Facility Length (Miles)",</w:t>
+      </w:r>
+      <w:r>
+        <w:br/>
+      </w:r>
+      <w:r>
+        <w:rPr>
+          <w:rStyle w:val="VerbatimChar"/>
+        </w:rPr>
+        <w:t xml:space="preserve">    grid: true,</w:t>
+      </w:r>
+      <w:r>
+        <w:br/>
+      </w:r>
+      <w:r>
+        <w:rPr>
+          <w:rStyle w:val="VerbatimChar"/>
+        </w:rPr>
+        <w:t xml:space="preserve">    nice: true</w:t>
+      </w:r>
+      <w:r>
+        <w:br/>
+      </w:r>
+      <w:r>
+        <w:rPr>
+          <w:rStyle w:val="VerbatimChar"/>
+        </w:rPr>
+        <w:t xml:space="preserve">  },</w:t>
+      </w:r>
+      <w:r>
+        <w:br/>
+      </w:r>
+      <w:r>
+        <w:rPr>
+          <w:rStyle w:val="VerbatimChar"/>
+        </w:rPr>
+        <w:t xml:space="preserve">  y: {</w:t>
+      </w:r>
+      <w:r>
+        <w:br/>
+      </w:r>
+      <w:r>
+        <w:rPr>
+          <w:rStyle w:val="VerbatimChar"/>
+        </w:rPr>
+        <w:t xml:space="preserve">    label: null,</w:t>
+      </w:r>
+      <w:r>
+        <w:br/>
+      </w:r>
+      <w:r>
+        <w:rPr>
+          <w:rStyle w:val="VerbatimChar"/>
+        </w:rPr>
+        <w:t xml:space="preserve">    // Sort y-axis (Cities) by the calculated TotalBike in descending order</w:t>
+      </w:r>
+      <w:r>
+        <w:br/>
+      </w:r>
+      <w:r>
+        <w:rPr>
+          <w:rStyle w:val="VerbatimChar"/>
+        </w:rPr>
+        <w:t xml:space="preserve">    domain: d3.sort(filtered, (a, b) =&gt; b.TotalBike - a.TotalBike).map(d =&gt; d.City)</w:t>
+      </w:r>
+      <w:r>
+        <w:br/>
+      </w:r>
+      <w:r>
+        <w:rPr>
+          <w:rStyle w:val="VerbatimChar"/>
+        </w:rPr>
+        <w:t xml:space="preserve">  },</w:t>
       </w:r>
       <w:r>
         <w:br/>
@@ -9699,6 +9852,15 @@
         <w:rPr>
           <w:rStyle w:val="VerbatimChar"/>
         </w:rPr>
+        <w:t xml:space="preserve">    // Custom Palette: Highlights high-quality infra (Teal/Blue) vs shared (Red/Grey)</w:t>
+      </w:r>
+      <w:r>
+        <w:br/>
+      </w:r>
+      <w:r>
+        <w:rPr>
+          <w:rStyle w:val="VerbatimChar"/>
+        </w:rPr>
         <w:t xml:space="preserve">    domain: ["Paved Path", "Protected Bike Lane", "Bike Lane", "Marked Route", "Unmarked Route"],</w:t>
       </w:r>
       <w:r>
@@ -9708,6 +9870,15 @@
         <w:rPr>
           <w:rStyle w:val="VerbatimChar"/>
         </w:rPr>
+        <w:t xml:space="preserve">    range: ["#008080", "#4682B4", "#DAA520", "#CD5C5C", "#A9A9A9"],</w:t>
+      </w:r>
+      <w:r>
+        <w:br/>
+      </w:r>
+      <w:r>
+        <w:rPr>
+          <w:rStyle w:val="VerbatimChar"/>
+        </w:rPr>
         <w:t xml:space="preserve">    legend: true</w:t>
       </w:r>
       <w:r>
@@ -9735,6 +9906,42 @@
         <w:rPr>
           <w:rStyle w:val="VerbatimChar"/>
         </w:rPr>
+        <w:t xml:space="preserve">    // Background rule for 0 baseline</w:t>
+      </w:r>
+      <w:r>
+        <w:br/>
+      </w:r>
+      <w:r>
+        <w:rPr>
+          <w:rStyle w:val="VerbatimChar"/>
+        </w:rPr>
+        <w:t xml:space="preserve">    Plot.ruleX([0]),</w:t>
+      </w:r>
+      <w:r>
+        <w:br/>
+      </w:r>
+      <w:r>
+        <w:rPr>
+          <w:rStyle w:val="VerbatimChar"/>
+        </w:rPr>
+        <w:t xml:space="preserve">    </w:t>
+      </w:r>
+      <w:r>
+        <w:br/>
+      </w:r>
+      <w:r>
+        <w:rPr>
+          <w:rStyle w:val="VerbatimChar"/>
+        </w:rPr>
+        <w:t xml:space="preserve">    // Stacked Bars</w:t>
+      </w:r>
+      <w:r>
+        <w:br/>
+      </w:r>
+      <w:r>
+        <w:rPr>
+          <w:rStyle w:val="VerbatimChar"/>
+        </w:rPr>
         <w:t xml:space="preserve">    Plot.barX(filtered, {</w:t>
       </w:r>
       <w:r>
@@ -9771,16 +9978,70 @@
         <w:rPr>
           <w:rStyle w:val="VerbatimChar"/>
         </w:rPr>
-        <w:t xml:space="preserve">      sort: {y: "x", reverse: true},</w:t>
-      </w:r>
-      <w:r>
-        <w:br/>
-      </w:r>
-      <w:r>
-        <w:rPr>
-          <w:rStyle w:val="VerbatimChar"/>
-        </w:rPr>
-        <w:t xml:space="preserve">      tip: true,</w:t>
+        <w:t xml:space="preserve">      order: "Type", // Ensures stack order matches legend</w:t>
+      </w:r>
+      <w:r>
+        <w:br/>
+      </w:r>
+      <w:r>
+        <w:rPr>
+          <w:rStyle w:val="VerbatimChar"/>
+        </w:rPr>
+        <w:t xml:space="preserve">      tip: {</w:t>
+      </w:r>
+      <w:r>
+        <w:br/>
+      </w:r>
+      <w:r>
+        <w:rPr>
+          <w:rStyle w:val="VerbatimChar"/>
+        </w:rPr>
+        <w:t xml:space="preserve">        format: {</w:t>
+      </w:r>
+      <w:r>
+        <w:br/>
+      </w:r>
+      <w:r>
+        <w:rPr>
+          <w:rStyle w:val="VerbatimChar"/>
+        </w:rPr>
+        <w:t xml:space="preserve">          x: true,</w:t>
+      </w:r>
+      <w:r>
+        <w:br/>
+      </w:r>
+      <w:r>
+        <w:rPr>
+          <w:rStyle w:val="VerbatimChar"/>
+        </w:rPr>
+        <w:t xml:space="preserve">          y: false,</w:t>
+      </w:r>
+      <w:r>
+        <w:br/>
+      </w:r>
+      <w:r>
+        <w:rPr>
+          <w:rStyle w:val="VerbatimChar"/>
+        </w:rPr>
+        <w:t xml:space="preserve">          fill: true</w:t>
+      </w:r>
+      <w:r>
+        <w:br/>
+      </w:r>
+      <w:r>
+        <w:rPr>
+          <w:rStyle w:val="VerbatimChar"/>
+        </w:rPr>
+        <w:t xml:space="preserve">        }</w:t>
+      </w:r>
+      <w:r>
+        <w:br/>
+      </w:r>
+      <w:r>
+        <w:rPr>
+          <w:rStyle w:val="VerbatimChar"/>
+        </w:rPr>
+        <w:t xml:space="preserve">      },</w:t>
       </w:r>
       <w:r>
         <w:br/>
@@ -9807,6 +10068,24 @@
         <w:rPr>
           <w:rStyle w:val="VerbatimChar"/>
         </w:rPr>
+        <w:t xml:space="preserve">    </w:t>
+      </w:r>
+      <w:r>
+        <w:br/>
+      </w:r>
+      <w:r>
+        <w:rPr>
+          <w:rStyle w:val="VerbatimChar"/>
+        </w:rPr>
+        <w:t xml:space="preserve">    // Total Road Miles Indicator</w:t>
+      </w:r>
+      <w:r>
+        <w:br/>
+      </w:r>
+      <w:r>
+        <w:rPr>
+          <w:rStyle w:val="VerbatimChar"/>
+        </w:rPr>
         <w:t xml:space="preserve">    Plot.tickX(filtered, {</w:t>
       </w:r>
       <w:r>
@@ -9834,7 +10113,7 @@
         <w:rPr>
           <w:rStyle w:val="VerbatimChar"/>
         </w:rPr>
-        <w:t xml:space="preserve">      stroke: "black",</w:t>
+        <w:t xml:space="preserve">      stroke: "#222",</w:t>
       </w:r>
       <w:r>
         <w:br/>
@@ -9852,7 +10131,16 @@
         <w:rPr>
           <w:rStyle w:val="VerbatimChar"/>
         </w:rPr>
-        <w:t xml:space="preserve">      title: d =&gt; `Total Road Miles: ${d.AllRoads}`</w:t>
+        <w:t xml:space="preserve">      opacity: 0.6, // Semi-transparent to not overpower the chart</w:t>
+      </w:r>
+      <w:r>
+        <w:br/>
+      </w:r>
+      <w:r>
+        <w:rPr>
+          <w:rStyle w:val="VerbatimChar"/>
+        </w:rPr>
+        <w:t xml:space="preserve">      title: d =&gt; `Total Road Network: ${d.AllRoads} miles`</w:t>
       </w:r>
       <w:r>
         <w:br/>

</xml_diff>

<commit_message>
change utah-bikeways plot to lolipop plot
</commit_message>
<xml_diff>
--- a/docs/posts/utah-bikeways/index.docx
+++ b/docs/posts/utah-bikeways/index.docx
@@ -9399,7 +9399,7 @@
         <w:rPr>
           <w:rStyle w:val="VerbatimChar"/>
         </w:rPr>
-        <w:t xml:space="preserve">// 1. Transpose data from R</w:t>
+        <w:t xml:space="preserve">// 1. Setup Data &amp; Metrics</w:t>
       </w:r>
       <w:r>
         <w:br/>
@@ -9420,55 +9420,34 @@
         <w:rPr>
           <w:rStyle w:val="VerbatimChar"/>
         </w:rPr>
-        <w:t xml:space="preserve">// 2. Create Inputs</w:t>
-      </w:r>
-      <w:r>
-        <w:br/>
-      </w:r>
-      <w:r>
-        <w:rPr>
-          <w:rStyle w:val="VerbatimChar"/>
-        </w:rPr>
-        <w:t xml:space="preserve">viewof search = Inputs.text({placeholder: "Search for a city...", label: "Find City"})</w:t>
-      </w:r>
-      <w:r>
-        <w:br/>
-      </w:r>
-      <w:r>
-        <w:rPr>
-          <w:rStyle w:val="VerbatimChar"/>
-        </w:rPr>
-        <w:t xml:space="preserve">viewof minMiles = Inputs.range([0, 50], {label: "Min Bike Miles", step: 1, value: 5})</w:t>
-      </w:r>
-      <w:r>
-        <w:br/>
-      </w:r>
-      <w:r>
-        <w:br/>
-      </w:r>
-      <w:r>
-        <w:rPr>
-          <w:rStyle w:val="VerbatimChar"/>
-        </w:rPr>
-        <w:t xml:space="preserve">// 3. Prepare data for plotting</w:t>
-      </w:r>
-      <w:r>
-        <w:br/>
-      </w:r>
-      <w:r>
-        <w:rPr>
-          <w:rStyle w:val="VerbatimChar"/>
-        </w:rPr>
-        <w:t xml:space="preserve">long_data = miles.flatMap(d =&gt; {</w:t>
-      </w:r>
-      <w:r>
-        <w:br/>
-      </w:r>
-      <w:r>
-        <w:rPr>
-          <w:rStyle w:val="VerbatimChar"/>
-        </w:rPr>
-        <w:t xml:space="preserve">  const types = ["Paved Path", "Protected Bike Lane", "Bike Lane", "Marked Route", "Unmarked Route"];</w:t>
+        <w:t xml:space="preserve">processedData = miles.map(d =&gt; {</w:t>
+      </w:r>
+      <w:r>
+        <w:br/>
+      </w:r>
+      <w:r>
+        <w:rPr>
+          <w:rStyle w:val="VerbatimChar"/>
+        </w:rPr>
+        <w:t xml:space="preserve">  const categories = ["Paved Path", "Protected Bike Lane", "Bike Lane", "Marked Route", "Unmarked Route"];</w:t>
+      </w:r>
+      <w:r>
+        <w:br/>
+      </w:r>
+      <w:r>
+        <w:rPr>
+          <w:rStyle w:val="VerbatimChar"/>
+        </w:rPr>
+        <w:t xml:space="preserve">  const totalBike = categories.reduce((sum, cat) =&gt; sum + (d[cat] || 0), 0);</w:t>
+      </w:r>
+      <w:r>
+        <w:br/>
+      </w:r>
+      <w:r>
+        <w:rPr>
+          <w:rStyle w:val="VerbatimChar"/>
+        </w:rPr>
+        <w:t xml:space="preserve">  const roadMiles = d["All Roads"] || 0;</w:t>
       </w:r>
       <w:r>
         <w:br/>
@@ -9486,97 +9465,61 @@
         <w:rPr>
           <w:rStyle w:val="VerbatimChar"/>
         </w:rPr>
-        <w:t xml:space="preserve">  // Calculate total bike miles for this row once to ensure consistency</w:t>
-      </w:r>
-      <w:r>
-        <w:br/>
-      </w:r>
-      <w:r>
-        <w:rPr>
-          <w:rStyle w:val="VerbatimChar"/>
-        </w:rPr>
-        <w:t xml:space="preserve">  const totalBike = types.reduce((sum, type) =&gt; sum + (d[type] || 0), 0);</w:t>
-      </w:r>
-      <w:r>
-        <w:br/>
-      </w:r>
-      <w:r>
-        <w:rPr>
-          <w:rStyle w:val="VerbatimChar"/>
-        </w:rPr>
-        <w:t xml:space="preserve">  </w:t>
-      </w:r>
-      <w:r>
-        <w:br/>
-      </w:r>
-      <w:r>
-        <w:rPr>
-          <w:rStyle w:val="VerbatimChar"/>
-        </w:rPr>
-        <w:t xml:space="preserve">  return types.map(t =&gt; ({</w:t>
-      </w:r>
-      <w:r>
-        <w:br/>
-      </w:r>
-      <w:r>
-        <w:rPr>
-          <w:rStyle w:val="VerbatimChar"/>
-        </w:rPr>
-        <w:t xml:space="preserve">    // SAFETY FIX: Handle null/NA names</w:t>
-      </w:r>
-      <w:r>
-        <w:br/>
-      </w:r>
-      <w:r>
-        <w:rPr>
-          <w:rStyle w:val="VerbatimChar"/>
-        </w:rPr>
-        <w:t xml:space="preserve">    City: d.Name || "Unincorporated", </w:t>
-      </w:r>
-      <w:r>
-        <w:br/>
-      </w:r>
-      <w:r>
-        <w:rPr>
-          <w:rStyle w:val="VerbatimChar"/>
-        </w:rPr>
-        <w:t xml:space="preserve">    Type: t,</w:t>
-      </w:r>
-      <w:r>
-        <w:br/>
-      </w:r>
-      <w:r>
-        <w:rPr>
-          <w:rStyle w:val="VerbatimChar"/>
-        </w:rPr>
-        <w:t xml:space="preserve">    Miles: d[t] || 0,</w:t>
-      </w:r>
-      <w:r>
-        <w:br/>
-      </w:r>
-      <w:r>
-        <w:rPr>
-          <w:rStyle w:val="VerbatimChar"/>
-        </w:rPr>
-        <w:t xml:space="preserve">    TotalBike: totalBike,</w:t>
-      </w:r>
-      <w:r>
-        <w:br/>
-      </w:r>
-      <w:r>
-        <w:rPr>
-          <w:rStyle w:val="VerbatimChar"/>
-        </w:rPr>
-        <w:t xml:space="preserve">    AllRoads: d["All Roads"] || 0</w:t>
-      </w:r>
-      <w:r>
-        <w:br/>
-      </w:r>
-      <w:r>
-        <w:rPr>
-          <w:rStyle w:val="VerbatimChar"/>
-        </w:rPr>
-        <w:t xml:space="preserve">  }));</w:t>
+        <w:t xml:space="preserve">  return {</w:t>
+      </w:r>
+      <w:r>
+        <w:br/>
+      </w:r>
+      <w:r>
+        <w:rPr>
+          <w:rStyle w:val="VerbatimChar"/>
+        </w:rPr>
+        <w:t xml:space="preserve">    ...d,</w:t>
+      </w:r>
+      <w:r>
+        <w:br/>
+      </w:r>
+      <w:r>
+        <w:rPr>
+          <w:rStyle w:val="VerbatimChar"/>
+        </w:rPr>
+        <w:t xml:space="preserve">    totalBike: totalBike,</w:t>
+      </w:r>
+      <w:r>
+        <w:br/>
+      </w:r>
+      <w:r>
+        <w:rPr>
+          <w:rStyle w:val="VerbatimChar"/>
+        </w:rPr>
+        <w:t xml:space="preserve">    // Calculate Density: Bike Miles per 100 Road Miles</w:t>
+      </w:r>
+      <w:r>
+        <w:br/>
+      </w:r>
+      <w:r>
+        <w:rPr>
+          <w:rStyle w:val="VerbatimChar"/>
+        </w:rPr>
+        <w:t xml:space="preserve">    density: roadMiles &gt; 0 ? (totalBike / roadMiles) * 100 : 0,</w:t>
+      </w:r>
+      <w:r>
+        <w:br/>
+      </w:r>
+      <w:r>
+        <w:rPr>
+          <w:rStyle w:val="VerbatimChar"/>
+        </w:rPr>
+        <w:t xml:space="preserve">    city: d.Name || "Unincorporated"</w:t>
+      </w:r>
+      <w:r>
+        <w:br/>
+      </w:r>
+      <w:r>
+        <w:rPr>
+          <w:rStyle w:val="VerbatimChar"/>
+        </w:rPr>
+        <w:t xml:space="preserve">  };</w:t>
       </w:r>
       <w:r>
         <w:br/>
@@ -9597,73 +9540,115 @@
         <w:rPr>
           <w:rStyle w:val="VerbatimChar"/>
         </w:rPr>
-        <w:t xml:space="preserve">// 4. Filter data</w:t>
-      </w:r>
-      <w:r>
-        <w:br/>
-      </w:r>
-      <w:r>
-        <w:rPr>
-          <w:rStyle w:val="VerbatimChar"/>
-        </w:rPr>
-        <w:t xml:space="preserve">filtered = long_data.filter(d =&gt; {</w:t>
-      </w:r>
-      <w:r>
-        <w:br/>
-      </w:r>
-      <w:r>
-        <w:rPr>
-          <w:rStyle w:val="VerbatimChar"/>
-        </w:rPr>
-        <w:t xml:space="preserve">  const city = d.City ? d.City.toLowerCase() : "";</w:t>
-      </w:r>
-      <w:r>
-        <w:br/>
-      </w:r>
-      <w:r>
-        <w:rPr>
-          <w:rStyle w:val="VerbatimChar"/>
-        </w:rPr>
-        <w:t xml:space="preserve">  const query = search.toLowerCase();</w:t>
-      </w:r>
-      <w:r>
-        <w:br/>
-      </w:r>
-      <w:r>
-        <w:rPr>
-          <w:rStyle w:val="VerbatimChar"/>
-        </w:rPr>
-        <w:t xml:space="preserve">  // Filter by name AND minimum mileage threshold</w:t>
-      </w:r>
-      <w:r>
-        <w:br/>
-      </w:r>
-      <w:r>
-        <w:rPr>
-          <w:rStyle w:val="VerbatimChar"/>
-        </w:rPr>
-        <w:t xml:space="preserve">  return city.includes(query) &amp;&amp; d.TotalBike &gt;= minMiles;</w:t>
-      </w:r>
-      <w:r>
-        <w:br/>
-      </w:r>
-      <w:r>
-        <w:rPr>
-          <w:rStyle w:val="VerbatimChar"/>
-        </w:rPr>
-        <w:t xml:space="preserve">})</w:t>
-      </w:r>
-      <w:r>
-        <w:br/>
-      </w:r>
-      <w:r>
-        <w:br/>
-      </w:r>
-      <w:r>
-        <w:rPr>
-          <w:rStyle w:val="VerbatimChar"/>
-        </w:rPr>
-        <w:t xml:space="preserve">// 5. Render Aesthetic Plot</w:t>
+        <w:t xml:space="preserve">// 2. Interactive Inputs</w:t>
+      </w:r>
+      <w:r>
+        <w:br/>
+      </w:r>
+      <w:r>
+        <w:rPr>
+          <w:rStyle w:val="VerbatimChar"/>
+        </w:rPr>
+        <w:t xml:space="preserve">viewof metric = Inputs.radio(</w:t>
+      </w:r>
+      <w:r>
+        <w:br/>
+      </w:r>
+      <w:r>
+        <w:rPr>
+          <w:rStyle w:val="VerbatimChar"/>
+        </w:rPr>
+        <w:t xml:space="preserve">  new Map([</w:t>
+      </w:r>
+      <w:r>
+        <w:br/>
+      </w:r>
+      <w:r>
+        <w:rPr>
+          <w:rStyle w:val="VerbatimChar"/>
+        </w:rPr>
+        <w:t xml:space="preserve">    ["Total Bikeway Miles", "totalBike"],</w:t>
+      </w:r>
+      <w:r>
+        <w:br/>
+      </w:r>
+      <w:r>
+        <w:rPr>
+          <w:rStyle w:val="VerbatimChar"/>
+        </w:rPr>
+        <w:t xml:space="preserve">    ["Bikeway Density (Miles per 100 Road Miles)", "density"]</w:t>
+      </w:r>
+      <w:r>
+        <w:br/>
+      </w:r>
+      <w:r>
+        <w:rPr>
+          <w:rStyle w:val="VerbatimChar"/>
+        </w:rPr>
+        <w:t xml:space="preserve">  ]), </w:t>
+      </w:r>
+      <w:r>
+        <w:br/>
+      </w:r>
+      <w:r>
+        <w:rPr>
+          <w:rStyle w:val="VerbatimChar"/>
+        </w:rPr>
+        <w:t xml:space="preserve">  {value: "totalBike", label: "Rank by:"}</w:t>
+      </w:r>
+      <w:r>
+        <w:br/>
+      </w:r>
+      <w:r>
+        <w:rPr>
+          <w:rStyle w:val="VerbatimChar"/>
+        </w:rPr>
+        <w:t xml:space="preserve">)</w:t>
+      </w:r>
+      <w:r>
+        <w:br/>
+      </w:r>
+      <w:r>
+        <w:br/>
+      </w:r>
+      <w:r>
+        <w:rPr>
+          <w:rStyle w:val="VerbatimChar"/>
+        </w:rPr>
+        <w:t xml:space="preserve">viewof topN = Inputs.range([10, 50], {label: "Show Top X Cities", step: 5, value: 20})</w:t>
+      </w:r>
+      <w:r>
+        <w:br/>
+      </w:r>
+      <w:r>
+        <w:br/>
+      </w:r>
+      <w:r>
+        <w:rPr>
+          <w:rStyle w:val="VerbatimChar"/>
+        </w:rPr>
+        <w:t xml:space="preserve">// 3. Filter and Sort</w:t>
+      </w:r>
+      <w:r>
+        <w:br/>
+      </w:r>
+      <w:r>
+        <w:rPr>
+          <w:rStyle w:val="VerbatimChar"/>
+        </w:rPr>
+        <w:t xml:space="preserve">topData = d3.sort(processedData, (a, b) =&gt; d3.descending(a[metric], b[metric])).slice(0, topN)</w:t>
+      </w:r>
+      <w:r>
+        <w:br/>
+      </w:r>
+      <w:r>
+        <w:br/>
+      </w:r>
+      <w:r>
+        <w:rPr>
+          <w:rStyle w:val="VerbatimChar"/>
+        </w:rPr>
+        <w:t xml:space="preserve">// 4. Render Visualization</w:t>
       </w:r>
       <w:r>
         <w:br/>
@@ -9681,61 +9666,79 @@
         <w:rPr>
           <w:rStyle w:val="VerbatimChar"/>
         </w:rPr>
-        <w:t xml:space="preserve">  title: "Bikeway Infrastructure by Municipality",</w:t>
-      </w:r>
-      <w:r>
-        <w:br/>
-      </w:r>
-      <w:r>
-        <w:rPr>
-          <w:rStyle w:val="VerbatimChar"/>
-        </w:rPr>
-        <w:t xml:space="preserve">  subtitle: "Comparing miles of separated paths, lanes, and routes. Black markers indicate total road miles.",</w:t>
-      </w:r>
-      <w:r>
-        <w:br/>
-      </w:r>
-      <w:r>
-        <w:rPr>
-          <w:rStyle w:val="VerbatimChar"/>
-        </w:rPr>
-        <w:t xml:space="preserve">  marginLeft: 160, // Extra space for city names</w:t>
-      </w:r>
-      <w:r>
-        <w:br/>
-      </w:r>
-      <w:r>
-        <w:rPr>
-          <w:rStyle w:val="VerbatimChar"/>
-        </w:rPr>
-        <w:t xml:space="preserve">  height: Math.max(400, new Set(filtered.map(d =&gt; d.City)).size * 22), // Dynamic height based on row count</w:t>
-      </w:r>
-      <w:r>
-        <w:br/>
-      </w:r>
-      <w:r>
-        <w:rPr>
-          <w:rStyle w:val="VerbatimChar"/>
-        </w:rPr>
-        <w:t xml:space="preserve">  style: {</w:t>
-      </w:r>
-      <w:r>
-        <w:br/>
-      </w:r>
-      <w:r>
-        <w:rPr>
-          <w:rStyle w:val="VerbatimChar"/>
-        </w:rPr>
-        <w:t xml:space="preserve">    fontSize: "13px",</w:t>
-      </w:r>
-      <w:r>
-        <w:br/>
-      </w:r>
-      <w:r>
-        <w:rPr>
-          <w:rStyle w:val="VerbatimChar"/>
-        </w:rPr>
-        <w:t xml:space="preserve">    fontFamily: "system-ui, sans-serif"</w:t>
+        <w:t xml:space="preserve">  title: "Utah's Leading Municipalities in Bicycle Infrastructure",</w:t>
+      </w:r>
+      <w:r>
+        <w:br/>
+      </w:r>
+      <w:r>
+        <w:rPr>
+          <w:rStyle w:val="VerbatimChar"/>
+        </w:rPr>
+        <w:t xml:space="preserve">  subtitle: `Top ${topN} cities ranked by ${metric === 'totalBike' ? 'total mileage' : 'miles per 100 roadway miles'}.`,</w:t>
+      </w:r>
+      <w:r>
+        <w:br/>
+      </w:r>
+      <w:r>
+        <w:rPr>
+          <w:rStyle w:val="VerbatimChar"/>
+        </w:rPr>
+        <w:t xml:space="preserve">  marginLeft: 150,</w:t>
+      </w:r>
+      <w:r>
+        <w:br/>
+      </w:r>
+      <w:r>
+        <w:rPr>
+          <w:rStyle w:val="VerbatimChar"/>
+        </w:rPr>
+        <w:t xml:space="preserve">  marginRight: 50,</w:t>
+      </w:r>
+      <w:r>
+        <w:br/>
+      </w:r>
+      <w:r>
+        <w:rPr>
+          <w:rStyle w:val="VerbatimChar"/>
+        </w:rPr>
+        <w:t xml:space="preserve">  width: 800,</w:t>
+      </w:r>
+      <w:r>
+        <w:br/>
+      </w:r>
+      <w:r>
+        <w:rPr>
+          <w:rStyle w:val="VerbatimChar"/>
+        </w:rPr>
+        <w:t xml:space="preserve">  height: topN * 25,</w:t>
+      </w:r>
+      <w:r>
+        <w:br/>
+      </w:r>
+      <w:r>
+        <w:rPr>
+          <w:rStyle w:val="VerbatimChar"/>
+        </w:rPr>
+        <w:t xml:space="preserve">  x: { </w:t>
+      </w:r>
+      <w:r>
+        <w:br/>
+      </w:r>
+      <w:r>
+        <w:rPr>
+          <w:rStyle w:val="VerbatimChar"/>
+        </w:rPr>
+        <w:t xml:space="preserve">    grid: true, </w:t>
+      </w:r>
+      <w:r>
+        <w:br/>
+      </w:r>
+      <w:r>
+        <w:rPr>
+          <w:rStyle w:val="VerbatimChar"/>
+        </w:rPr>
+        <w:t xml:space="preserve">    label: metric === 'totalBike' ? "Total Miles →" : "Bike Miles / 100 Road Miles →" </w:t>
       </w:r>
       <w:r>
         <w:br/>
@@ -9753,34 +9756,43 @@
         <w:rPr>
           <w:rStyle w:val="VerbatimChar"/>
         </w:rPr>
-        <w:t xml:space="preserve">  x: {</w:t>
-      </w:r>
-      <w:r>
-        <w:br/>
-      </w:r>
-      <w:r>
-        <w:rPr>
-          <w:rStyle w:val="VerbatimChar"/>
-        </w:rPr>
-        <w:t xml:space="preserve">    label: "Facility Length (Miles)",</w:t>
-      </w:r>
-      <w:r>
-        <w:br/>
-      </w:r>
-      <w:r>
-        <w:rPr>
-          <w:rStyle w:val="VerbatimChar"/>
-        </w:rPr>
-        <w:t xml:space="preserve">    grid: true,</w:t>
-      </w:r>
-      <w:r>
-        <w:br/>
-      </w:r>
-      <w:r>
-        <w:rPr>
-          <w:rStyle w:val="VerbatimChar"/>
-        </w:rPr>
-        <w:t xml:space="preserve">    nice: true</w:t>
+        <w:t xml:space="preserve">  y: { label: null },</w:t>
+      </w:r>
+      <w:r>
+        <w:br/>
+      </w:r>
+      <w:r>
+        <w:rPr>
+          <w:rStyle w:val="VerbatimChar"/>
+        </w:rPr>
+        <w:t xml:space="preserve">  color: {</w:t>
+      </w:r>
+      <w:r>
+        <w:br/>
+      </w:r>
+      <w:r>
+        <w:rPr>
+          <w:rStyle w:val="VerbatimChar"/>
+        </w:rPr>
+        <w:t xml:space="preserve">    domain: ["Paved Path", "Protected Bike Lane", "Bike Lane", "Marked Route", "Unmarked Route"],</w:t>
+      </w:r>
+      <w:r>
+        <w:br/>
+      </w:r>
+      <w:r>
+        <w:rPr>
+          <w:rStyle w:val="VerbatimChar"/>
+        </w:rPr>
+        <w:t xml:space="preserve">    range: ["#006d77", "#83c5be", "#e29578", "#ffddd2", "#9ca3af"], // Professional Teal/TerraCotta palette</w:t>
+      </w:r>
+      <w:r>
+        <w:br/>
+      </w:r>
+      <w:r>
+        <w:rPr>
+          <w:rStyle w:val="VerbatimChar"/>
+        </w:rPr>
+        <w:t xml:space="preserve">    legend: true</w:t>
       </w:r>
       <w:r>
         <w:br/>
@@ -9798,105 +9810,6 @@
         <w:rPr>
           <w:rStyle w:val="VerbatimChar"/>
         </w:rPr>
-        <w:t xml:space="preserve">  y: {</w:t>
-      </w:r>
-      <w:r>
-        <w:br/>
-      </w:r>
-      <w:r>
-        <w:rPr>
-          <w:rStyle w:val="VerbatimChar"/>
-        </w:rPr>
-        <w:t xml:space="preserve">    label: null,</w:t>
-      </w:r>
-      <w:r>
-        <w:br/>
-      </w:r>
-      <w:r>
-        <w:rPr>
-          <w:rStyle w:val="VerbatimChar"/>
-        </w:rPr>
-        <w:t xml:space="preserve">    // Sort y-axis (Cities) by the calculated TotalBike in descending order</w:t>
-      </w:r>
-      <w:r>
-        <w:br/>
-      </w:r>
-      <w:r>
-        <w:rPr>
-          <w:rStyle w:val="VerbatimChar"/>
-        </w:rPr>
-        <w:t xml:space="preserve">    domain: d3.sort(filtered, (a, b) =&gt; b.TotalBike - a.TotalBike).map(d =&gt; d.City)</w:t>
-      </w:r>
-      <w:r>
-        <w:br/>
-      </w:r>
-      <w:r>
-        <w:rPr>
-          <w:rStyle w:val="VerbatimChar"/>
-        </w:rPr>
-        <w:t xml:space="preserve">  },</w:t>
-      </w:r>
-      <w:r>
-        <w:br/>
-      </w:r>
-      <w:r>
-        <w:rPr>
-          <w:rStyle w:val="VerbatimChar"/>
-        </w:rPr>
-        <w:t xml:space="preserve">  color: {</w:t>
-      </w:r>
-      <w:r>
-        <w:br/>
-      </w:r>
-      <w:r>
-        <w:rPr>
-          <w:rStyle w:val="VerbatimChar"/>
-        </w:rPr>
-        <w:t xml:space="preserve">    // Custom Palette: Highlights high-quality infra (Teal/Blue) vs shared (Red/Grey)</w:t>
-      </w:r>
-      <w:r>
-        <w:br/>
-      </w:r>
-      <w:r>
-        <w:rPr>
-          <w:rStyle w:val="VerbatimChar"/>
-        </w:rPr>
-        <w:t xml:space="preserve">    domain: ["Paved Path", "Protected Bike Lane", "Bike Lane", "Marked Route", "Unmarked Route"],</w:t>
-      </w:r>
-      <w:r>
-        <w:br/>
-      </w:r>
-      <w:r>
-        <w:rPr>
-          <w:rStyle w:val="VerbatimChar"/>
-        </w:rPr>
-        <w:t xml:space="preserve">    range: ["#008080", "#4682B4", "#DAA520", "#CD5C5C", "#A9A9A9"],</w:t>
-      </w:r>
-      <w:r>
-        <w:br/>
-      </w:r>
-      <w:r>
-        <w:rPr>
-          <w:rStyle w:val="VerbatimChar"/>
-        </w:rPr>
-        <w:t xml:space="preserve">    legend: true</w:t>
-      </w:r>
-      <w:r>
-        <w:br/>
-      </w:r>
-      <w:r>
-        <w:rPr>
-          <w:rStyle w:val="VerbatimChar"/>
-        </w:rPr>
-        <w:t xml:space="preserve">  },</w:t>
-      </w:r>
-      <w:r>
-        <w:br/>
-      </w:r>
-      <w:r>
-        <w:rPr>
-          <w:rStyle w:val="VerbatimChar"/>
-        </w:rPr>
         <w:t xml:space="preserve">  marks: [</w:t>
       </w:r>
       <w:r>
@@ -9906,16 +9819,34 @@
         <w:rPr>
           <w:rStyle w:val="VerbatimChar"/>
         </w:rPr>
-        <w:t xml:space="preserve">    // Background rule for 0 baseline</w:t>
-      </w:r>
-      <w:r>
-        <w:br/>
-      </w:r>
-      <w:r>
-        <w:rPr>
-          <w:rStyle w:val="VerbatimChar"/>
-        </w:rPr>
-        <w:t xml:space="preserve">    Plot.ruleX([0]),</w:t>
+        <w:t xml:space="preserve">    // Background Road Mile Reference (Only for Total Miles view)</w:t>
+      </w:r>
+      <w:r>
+        <w:br/>
+      </w:r>
+      <w:r>
+        <w:rPr>
+          <w:rStyle w:val="VerbatimChar"/>
+        </w:rPr>
+        <w:t xml:space="preserve">    metric === "totalBike" </w:t>
+      </w:r>
+      <w:r>
+        <w:br/>
+      </w:r>
+      <w:r>
+        <w:rPr>
+          <w:rStyle w:val="VerbatimChar"/>
+        </w:rPr>
+        <w:t xml:space="preserve">      ? Plot.ruleY(topData, {y: "city", x1: 0, x2: "All Roads", stroke: "#e5e7eb", strokeWidth: 8, strokeLinecap: "round"})</w:t>
+      </w:r>
+      <w:r>
+        <w:br/>
+      </w:r>
+      <w:r>
+        <w:rPr>
+          <w:rStyle w:val="VerbatimChar"/>
+        </w:rPr>
+        <w:t xml:space="preserve">      : null,</w:t>
       </w:r>
       <w:r>
         <w:br/>
@@ -9933,133 +9864,16 @@
         <w:rPr>
           <w:rStyle w:val="VerbatimChar"/>
         </w:rPr>
-        <w:t xml:space="preserve">    // Stacked Bars</w:t>
-      </w:r>
-      <w:r>
-        <w:br/>
-      </w:r>
-      <w:r>
-        <w:rPr>
-          <w:rStyle w:val="VerbatimChar"/>
-        </w:rPr>
-        <w:t xml:space="preserve">    Plot.barX(filtered, {</w:t>
-      </w:r>
-      <w:r>
-        <w:br/>
-      </w:r>
-      <w:r>
-        <w:rPr>
-          <w:rStyle w:val="VerbatimChar"/>
-        </w:rPr>
-        <w:t xml:space="preserve">      x: "Miles",</w:t>
-      </w:r>
-      <w:r>
-        <w:br/>
-      </w:r>
-      <w:r>
-        <w:rPr>
-          <w:rStyle w:val="VerbatimChar"/>
-        </w:rPr>
-        <w:t xml:space="preserve">      y: "City",</w:t>
-      </w:r>
-      <w:r>
-        <w:br/>
-      </w:r>
-      <w:r>
-        <w:rPr>
-          <w:rStyle w:val="VerbatimChar"/>
-        </w:rPr>
-        <w:t xml:space="preserve">      fill: "Type",</w:t>
-      </w:r>
-      <w:r>
-        <w:br/>
-      </w:r>
-      <w:r>
-        <w:rPr>
-          <w:rStyle w:val="VerbatimChar"/>
-        </w:rPr>
-        <w:t xml:space="preserve">      order: "Type", // Ensures stack order matches legend</w:t>
-      </w:r>
-      <w:r>
-        <w:br/>
-      </w:r>
-      <w:r>
-        <w:rPr>
-          <w:rStyle w:val="VerbatimChar"/>
-        </w:rPr>
-        <w:t xml:space="preserve">      tip: {</w:t>
-      </w:r>
-      <w:r>
-        <w:br/>
-      </w:r>
-      <w:r>
-        <w:rPr>
-          <w:rStyle w:val="VerbatimChar"/>
-        </w:rPr>
-        <w:t xml:space="preserve">        format: {</w:t>
-      </w:r>
-      <w:r>
-        <w:br/>
-      </w:r>
-      <w:r>
-        <w:rPr>
-          <w:rStyle w:val="VerbatimChar"/>
-        </w:rPr>
-        <w:t xml:space="preserve">          x: true,</w:t>
-      </w:r>
-      <w:r>
-        <w:br/>
-      </w:r>
-      <w:r>
-        <w:rPr>
-          <w:rStyle w:val="VerbatimChar"/>
-        </w:rPr>
-        <w:t xml:space="preserve">          y: false,</w:t>
-      </w:r>
-      <w:r>
-        <w:br/>
-      </w:r>
-      <w:r>
-        <w:rPr>
-          <w:rStyle w:val="VerbatimChar"/>
-        </w:rPr>
-        <w:t xml:space="preserve">          fill: true</w:t>
-      </w:r>
-      <w:r>
-        <w:br/>
-      </w:r>
-      <w:r>
-        <w:rPr>
-          <w:rStyle w:val="VerbatimChar"/>
-        </w:rPr>
-        <w:t xml:space="preserve">        }</w:t>
-      </w:r>
-      <w:r>
-        <w:br/>
-      </w:r>
-      <w:r>
-        <w:rPr>
-          <w:rStyle w:val="VerbatimChar"/>
-        </w:rPr>
-        <w:t xml:space="preserve">      },</w:t>
-      </w:r>
-      <w:r>
-        <w:br/>
-      </w:r>
-      <w:r>
-        <w:rPr>
-          <w:rStyle w:val="VerbatimChar"/>
-        </w:rPr>
-        <w:t xml:space="preserve">      title: d =&gt; `${d.City}\n${d.Type}: ${d.Miles} miles`</w:t>
-      </w:r>
-      <w:r>
-        <w:br/>
-      </w:r>
-      <w:r>
-        <w:rPr>
-          <w:rStyle w:val="VerbatimChar"/>
-        </w:rPr>
-        <w:t xml:space="preserve">    }),</w:t>
+        <w:t xml:space="preserve">    // Lollipop Stems</w:t>
+      </w:r>
+      <w:r>
+        <w:br/>
+      </w:r>
+      <w:r>
+        <w:rPr>
+          <w:rStyle w:val="VerbatimChar"/>
+        </w:rPr>
+        <w:t xml:space="preserve">    Plot.ruleY(topData, {y: "city", x: metric, stroke: "#374151", strokeWidth: 1}),</w:t>
       </w:r>
       <w:r>
         <w:br/>
@@ -10077,70 +9891,259 @@
         <w:rPr>
           <w:rStyle w:val="VerbatimChar"/>
         </w:rPr>
-        <w:t xml:space="preserve">    // Total Road Miles Indicator</w:t>
-      </w:r>
-      <w:r>
-        <w:br/>
-      </w:r>
-      <w:r>
-        <w:rPr>
-          <w:rStyle w:val="VerbatimChar"/>
-        </w:rPr>
-        <w:t xml:space="preserve">    Plot.tickX(filtered, {</w:t>
-      </w:r>
-      <w:r>
-        <w:br/>
-      </w:r>
-      <w:r>
-        <w:rPr>
-          <w:rStyle w:val="VerbatimChar"/>
-        </w:rPr>
-        <w:t xml:space="preserve">      x: "AllRoads",</w:t>
-      </w:r>
-      <w:r>
-        <w:br/>
-      </w:r>
-      <w:r>
-        <w:rPr>
-          <w:rStyle w:val="VerbatimChar"/>
-        </w:rPr>
-        <w:t xml:space="preserve">      y: "City",</w:t>
-      </w:r>
-      <w:r>
-        <w:br/>
-      </w:r>
-      <w:r>
-        <w:rPr>
-          <w:rStyle w:val="VerbatimChar"/>
-        </w:rPr>
-        <w:t xml:space="preserve">      stroke: "#222",</w:t>
-      </w:r>
-      <w:r>
-        <w:br/>
-      </w:r>
-      <w:r>
-        <w:rPr>
-          <w:rStyle w:val="VerbatimChar"/>
-        </w:rPr>
-        <w:t xml:space="preserve">      strokeWidth: 2,</w:t>
-      </w:r>
-      <w:r>
-        <w:br/>
-      </w:r>
-      <w:r>
-        <w:rPr>
-          <w:rStyle w:val="VerbatimChar"/>
-        </w:rPr>
-        <w:t xml:space="preserve">      opacity: 0.6, // Semi-transparent to not overpower the chart</w:t>
-      </w:r>
-      <w:r>
-        <w:br/>
-      </w:r>
-      <w:r>
-        <w:rPr>
-          <w:rStyle w:val="VerbatimChar"/>
-        </w:rPr>
-        <w:t xml:space="preserve">      title: d =&gt; `Total Road Network: ${d.AllRoads} miles`</w:t>
+        <w:t xml:space="preserve">    // Stacked Segmented Lollipops (The "Candy")</w:t>
+      </w:r>
+      <w:r>
+        <w:br/>
+      </w:r>
+      <w:r>
+        <w:rPr>
+          <w:rStyle w:val="VerbatimChar"/>
+        </w:rPr>
+        <w:t xml:space="preserve">    Plot.dotX(</w:t>
+      </w:r>
+      <w:r>
+        <w:br/>
+      </w:r>
+      <w:r>
+        <w:rPr>
+          <w:rStyle w:val="VerbatimChar"/>
+        </w:rPr>
+        <w:t xml:space="preserve">      topData.flatMap(d =&gt; {</w:t>
+      </w:r>
+      <w:r>
+        <w:br/>
+      </w:r>
+      <w:r>
+        <w:rPr>
+          <w:rStyle w:val="VerbatimChar"/>
+        </w:rPr>
+        <w:t xml:space="preserve">        const cats = ["Paved Path", "Protected Bike Lane", "Bike Lane", "Marked Route", "Unmarked Route"];</w:t>
+      </w:r>
+      <w:r>
+        <w:br/>
+      </w:r>
+      <w:r>
+        <w:rPr>
+          <w:rStyle w:val="VerbatimChar"/>
+        </w:rPr>
+        <w:t xml:space="preserve">        let currentX = 0;</w:t>
+      </w:r>
+      <w:r>
+        <w:br/>
+      </w:r>
+      <w:r>
+        <w:rPr>
+          <w:rStyle w:val="VerbatimChar"/>
+        </w:rPr>
+        <w:t xml:space="preserve">        return cats.map(cat =&gt; {</w:t>
+      </w:r>
+      <w:r>
+        <w:br/>
+      </w:r>
+      <w:r>
+        <w:rPr>
+          <w:rStyle w:val="VerbatimChar"/>
+        </w:rPr>
+        <w:t xml:space="preserve">          const val = metric === "totalBike" ? d[cat] : (d[cat] / d["All Roads"]) * 100;</w:t>
+      </w:r>
+      <w:r>
+        <w:br/>
+      </w:r>
+      <w:r>
+        <w:rPr>
+          <w:rStyle w:val="VerbatimChar"/>
+        </w:rPr>
+        <w:t xml:space="preserve">          currentX += val;</w:t>
+      </w:r>
+      <w:r>
+        <w:br/>
+      </w:r>
+      <w:r>
+        <w:rPr>
+          <w:rStyle w:val="VerbatimChar"/>
+        </w:rPr>
+        <w:t xml:space="preserve">          return { city: d.city, type: cat, value: currentX, individual: val };</w:t>
+      </w:r>
+      <w:r>
+        <w:br/>
+      </w:r>
+      <w:r>
+        <w:rPr>
+          <w:rStyle w:val="VerbatimChar"/>
+        </w:rPr>
+        <w:t xml:space="preserve">        }).filter(v =&gt; v.individual &gt; 0);</w:t>
+      </w:r>
+      <w:r>
+        <w:br/>
+      </w:r>
+      <w:r>
+        <w:rPr>
+          <w:rStyle w:val="VerbatimChar"/>
+        </w:rPr>
+        <w:t xml:space="preserve">      }), </w:t>
+      </w:r>
+      <w:r>
+        <w:br/>
+      </w:r>
+      <w:r>
+        <w:rPr>
+          <w:rStyle w:val="VerbatimChar"/>
+        </w:rPr>
+        <w:t xml:space="preserve">      {</w:t>
+      </w:r>
+      <w:r>
+        <w:br/>
+      </w:r>
+      <w:r>
+        <w:rPr>
+          <w:rStyle w:val="VerbatimChar"/>
+        </w:rPr>
+        <w:t xml:space="preserve">        x: "value", </w:t>
+      </w:r>
+      <w:r>
+        <w:br/>
+      </w:r>
+      <w:r>
+        <w:rPr>
+          <w:rStyle w:val="VerbatimChar"/>
+        </w:rPr>
+        <w:t xml:space="preserve">        y: "city", </w:t>
+      </w:r>
+      <w:r>
+        <w:br/>
+      </w:r>
+      <w:r>
+        <w:rPr>
+          <w:rStyle w:val="VerbatimChar"/>
+        </w:rPr>
+        <w:t xml:space="preserve">        fill: "type", </w:t>
+      </w:r>
+      <w:r>
+        <w:br/>
+      </w:r>
+      <w:r>
+        <w:rPr>
+          <w:rStyle w:val="VerbatimChar"/>
+        </w:rPr>
+        <w:t xml:space="preserve">        r: 6,</w:t>
+      </w:r>
+      <w:r>
+        <w:br/>
+      </w:r>
+      <w:r>
+        <w:rPr>
+          <w:rStyle w:val="VerbatimChar"/>
+        </w:rPr>
+        <w:t xml:space="preserve">        stroke: "white",</w:t>
+      </w:r>
+      <w:r>
+        <w:br/>
+      </w:r>
+      <w:r>
+        <w:rPr>
+          <w:rStyle w:val="VerbatimChar"/>
+        </w:rPr>
+        <w:t xml:space="preserve">        title: d =&gt; `${d.city}\n${d.type}: ${d.individual.toFixed(2)}`</w:t>
+      </w:r>
+      <w:r>
+        <w:br/>
+      </w:r>
+      <w:r>
+        <w:rPr>
+          <w:rStyle w:val="VerbatimChar"/>
+        </w:rPr>
+        <w:t xml:space="preserve">      }</w:t>
+      </w:r>
+      <w:r>
+        <w:br/>
+      </w:r>
+      <w:r>
+        <w:rPr>
+          <w:rStyle w:val="VerbatimChar"/>
+        </w:rPr>
+        <w:t xml:space="preserve">    ),</w:t>
+      </w:r>
+      <w:r>
+        <w:br/>
+      </w:r>
+      <w:r>
+        <w:rPr>
+          <w:rStyle w:val="VerbatimChar"/>
+        </w:rPr>
+        <w:t xml:space="preserve">    </w:t>
+      </w:r>
+      <w:r>
+        <w:br/>
+      </w:r>
+      <w:r>
+        <w:rPr>
+          <w:rStyle w:val="VerbatimChar"/>
+        </w:rPr>
+        <w:t xml:space="preserve">    // Labels for the end of the bars</w:t>
+      </w:r>
+      <w:r>
+        <w:br/>
+      </w:r>
+      <w:r>
+        <w:rPr>
+          <w:rStyle w:val="VerbatimChar"/>
+        </w:rPr>
+        <w:t xml:space="preserve">    Plot.text(topData, {</w:t>
+      </w:r>
+      <w:r>
+        <w:br/>
+      </w:r>
+      <w:r>
+        <w:rPr>
+          <w:rStyle w:val="VerbatimChar"/>
+        </w:rPr>
+        <w:t xml:space="preserve">      x: metric,</w:t>
+      </w:r>
+      <w:r>
+        <w:br/>
+      </w:r>
+      <w:r>
+        <w:rPr>
+          <w:rStyle w:val="VerbatimChar"/>
+        </w:rPr>
+        <w:t xml:space="preserve">      y: "city",</w:t>
+      </w:r>
+      <w:r>
+        <w:br/>
+      </w:r>
+      <w:r>
+        <w:rPr>
+          <w:rStyle w:val="VerbatimChar"/>
+        </w:rPr>
+        <w:t xml:space="preserve">      text: d =&gt; d[metric].toFixed(1),</w:t>
+      </w:r>
+      <w:r>
+        <w:br/>
+      </w:r>
+      <w:r>
+        <w:rPr>
+          <w:rStyle w:val="VerbatimChar"/>
+        </w:rPr>
+        <w:t xml:space="preserve">      dx: 25,</w:t>
+      </w:r>
+      <w:r>
+        <w:br/>
+      </w:r>
+      <w:r>
+        <w:rPr>
+          <w:rStyle w:val="VerbatimChar"/>
+        </w:rPr>
+        <w:t xml:space="preserve">      fontSize: 10,</w:t>
+      </w:r>
+      <w:r>
+        <w:br/>
+      </w:r>
+      <w:r>
+        <w:rPr>
+          <w:rStyle w:val="VerbatimChar"/>
+        </w:rPr>
+        <w:t xml:space="preserve">      fontWeight: "bold"</w:t>
       </w:r>
       <w:r>
         <w:br/>

</xml_diff>

<commit_message>
fix utah bikeways plot
</commit_message>
<xml_diff>
--- a/docs/posts/utah-bikeways/index.docx
+++ b/docs/posts/utah-bikeways/index.docx
@@ -9399,73 +9399,274 @@
         <w:rPr>
           <w:rStyle w:val="VerbatimChar"/>
         </w:rPr>
-        <w:t xml:space="preserve">// 1. Setup Data &amp; Metrics</w:t>
-      </w:r>
-      <w:r>
-        <w:br/>
-      </w:r>
-      <w:r>
-        <w:rPr>
-          <w:rStyle w:val="VerbatimChar"/>
-        </w:rPr>
-        <w:t xml:space="preserve">miles = transpose(miles_data)</w:t>
-      </w:r>
-      <w:r>
-        <w:br/>
-      </w:r>
-      <w:r>
-        <w:br/>
-      </w:r>
-      <w:r>
-        <w:rPr>
-          <w:rStyle w:val="VerbatimChar"/>
-        </w:rPr>
-        <w:t xml:space="preserve">processedData = miles.map(d =&gt; {</w:t>
-      </w:r>
-      <w:r>
-        <w:br/>
-      </w:r>
-      <w:r>
-        <w:rPr>
-          <w:rStyle w:val="VerbatimChar"/>
-        </w:rPr>
-        <w:t xml:space="preserve">  const categories = ["Paved Path", "Protected Bike Lane", "Bike Lane", "Marked Route", "Unmarked Route"];</w:t>
-      </w:r>
-      <w:r>
-        <w:br/>
-      </w:r>
-      <w:r>
-        <w:rPr>
-          <w:rStyle w:val="VerbatimChar"/>
-        </w:rPr>
-        <w:t xml:space="preserve">  const totalBike = categories.reduce((sum, cat) =&gt; sum + (d[cat] || 0), 0);</w:t>
-      </w:r>
-      <w:r>
-        <w:br/>
-      </w:r>
-      <w:r>
-        <w:rPr>
-          <w:rStyle w:val="VerbatimChar"/>
-        </w:rPr>
-        <w:t xml:space="preserve">  const roadMiles = d["All Roads"] || 0;</w:t>
-      </w:r>
-      <w:r>
-        <w:br/>
-      </w:r>
-      <w:r>
-        <w:rPr>
-          <w:rStyle w:val="VerbatimChar"/>
-        </w:rPr>
-        <w:t xml:space="preserve">  </w:t>
-      </w:r>
-      <w:r>
-        <w:br/>
-      </w:r>
-      <w:r>
-        <w:rPr>
-          <w:rStyle w:val="VerbatimChar"/>
-        </w:rPr>
-        <w:t xml:space="preserve">  return {</w:t>
+        <w:t xml:space="preserve">// 1. Multi-select Dropdown for Bikeway Types</w:t>
+      </w:r>
+      <w:r>
+        <w:br/>
+      </w:r>
+      <w:r>
+        <w:rPr>
+          <w:rStyle w:val="VerbatimChar"/>
+        </w:rPr>
+        <w:t xml:space="preserve">viewof bikeTypes = Inputs.select(</w:t>
+      </w:r>
+      <w:r>
+        <w:br/>
+      </w:r>
+      <w:r>
+        <w:rPr>
+          <w:rStyle w:val="VerbatimChar"/>
+        </w:rPr>
+        <w:t xml:space="preserve">  ["Paved Path", "Protected Bike Lane", "Bike Lane", "Marked Route", "Unmarked Route"],</w:t>
+      </w:r>
+      <w:r>
+        <w:br/>
+      </w:r>
+      <w:r>
+        <w:rPr>
+          <w:rStyle w:val="VerbatimChar"/>
+        </w:rPr>
+        <w:t xml:space="preserve">  {</w:t>
+      </w:r>
+      <w:r>
+        <w:br/>
+      </w:r>
+      <w:r>
+        <w:rPr>
+          <w:rStyle w:val="VerbatimChar"/>
+        </w:rPr>
+        <w:t xml:space="preserve">    value: ["Paved Path", "Protected Bike Lane"], // High-quality defaults</w:t>
+      </w:r>
+      <w:r>
+        <w:br/>
+      </w:r>
+      <w:r>
+        <w:rPr>
+          <w:rStyle w:val="VerbatimChar"/>
+        </w:rPr>
+        <w:t xml:space="preserve">    label: "Select Facility Types:",</w:t>
+      </w:r>
+      <w:r>
+        <w:br/>
+      </w:r>
+      <w:r>
+        <w:rPr>
+          <w:rStyle w:val="VerbatimChar"/>
+        </w:rPr>
+        <w:t xml:space="preserve">    multiple: true // Enables the multi-select dropdown behavior</w:t>
+      </w:r>
+      <w:r>
+        <w:br/>
+      </w:r>
+      <w:r>
+        <w:rPr>
+          <w:rStyle w:val="VerbatimChar"/>
+        </w:rPr>
+        <w:t xml:space="preserve">  }</w:t>
+      </w:r>
+      <w:r>
+        <w:br/>
+      </w:r>
+      <w:r>
+        <w:rPr>
+          <w:rStyle w:val="VerbatimChar"/>
+        </w:rPr>
+        <w:t xml:space="preserve">)</w:t>
+      </w:r>
+      <w:r>
+        <w:br/>
+      </w:r>
+      <w:r>
+        <w:br/>
+      </w:r>
+      <w:r>
+        <w:rPr>
+          <w:rStyle w:val="VerbatimChar"/>
+        </w:rPr>
+        <w:t xml:space="preserve">// 2. City Search with robust error handling</w:t>
+      </w:r>
+      <w:r>
+        <w:br/>
+      </w:r>
+      <w:r>
+        <w:rPr>
+          <w:rStyle w:val="VerbatimChar"/>
+        </w:rPr>
+        <w:t xml:space="preserve">viewof searchCity = Inputs.text({placeholder: "Search City (e.g. Salt Lake City)", label: "Highlight City"})</w:t>
+      </w:r>
+      <w:r>
+        <w:br/>
+      </w:r>
+      <w:r>
+        <w:br/>
+      </w:r>
+      <w:r>
+        <w:rPr>
+          <w:rStyle w:val="VerbatimChar"/>
+        </w:rPr>
+        <w:t xml:space="preserve">// 3. Dynamic Data Processing</w:t>
+      </w:r>
+      <w:r>
+        <w:br/>
+      </w:r>
+      <w:r>
+        <w:rPr>
+          <w:rStyle w:val="VerbatimChar"/>
+        </w:rPr>
+        <w:t xml:space="preserve">processedData = {</w:t>
+      </w:r>
+      <w:r>
+        <w:br/>
+      </w:r>
+      <w:r>
+        <w:rPr>
+          <w:rStyle w:val="VerbatimChar"/>
+        </w:rPr>
+        <w:t xml:space="preserve">  const selectedTypes = bikeTypes;</w:t>
+      </w:r>
+      <w:r>
+        <w:br/>
+      </w:r>
+      <w:r>
+        <w:rPr>
+          <w:rStyle w:val="VerbatimChar"/>
+        </w:rPr>
+        <w:t xml:space="preserve">  const data = transpose(miles_data)</w:t>
+      </w:r>
+      <w:r>
+        <w:br/>
+      </w:r>
+      <w:r>
+        <w:rPr>
+          <w:rStyle w:val="VerbatimChar"/>
+        </w:rPr>
+        <w:t xml:space="preserve">    // Filter out rows with missing names or zero road miles</w:t>
+      </w:r>
+      <w:r>
+        <w:br/>
+      </w:r>
+      <w:r>
+        <w:rPr>
+          <w:rStyle w:val="VerbatimChar"/>
+        </w:rPr>
+        <w:t xml:space="preserve">    .filter(d =&gt; d.Name &amp;&amp; d.Name !== "NA" &amp;&amp; d["All Roads"] &gt; 0)</w:t>
+      </w:r>
+      <w:r>
+        <w:br/>
+      </w:r>
+      <w:r>
+        <w:rPr>
+          <w:rStyle w:val="VerbatimChar"/>
+        </w:rPr>
+        <w:t xml:space="preserve">    .map(d =&gt; {</w:t>
+      </w:r>
+      <w:r>
+        <w:br/>
+      </w:r>
+      <w:r>
+        <w:rPr>
+          <w:rStyle w:val="VerbatimChar"/>
+        </w:rPr>
+        <w:t xml:space="preserve">      const roadMiles = d["All Roads"] || 0;</w:t>
+      </w:r>
+      <w:r>
+        <w:br/>
+      </w:r>
+      <w:r>
+        <w:rPr>
+          <w:rStyle w:val="VerbatimChar"/>
+        </w:rPr>
+        <w:t xml:space="preserve">      const selectedBikeMiles = selectedTypes.reduce((acc, type) =&gt; acc + (parseFloat(d[type]) || 0), 0);</w:t>
+      </w:r>
+      <w:r>
+        <w:br/>
+      </w:r>
+      <w:r>
+        <w:rPr>
+          <w:rStyle w:val="VerbatimChar"/>
+        </w:rPr>
+        <w:t xml:space="preserve">      const ratio = (selectedBikeMiles / roadMiles) * 100;</w:t>
+      </w:r>
+      <w:r>
+        <w:br/>
+      </w:r>
+      <w:r>
+        <w:br/>
+      </w:r>
+      <w:r>
+        <w:rPr>
+          <w:rStyle w:val="VerbatimChar"/>
+        </w:rPr>
+        <w:t xml:space="preserve">      return {</w:t>
+      </w:r>
+      <w:r>
+        <w:br/>
+      </w:r>
+      <w:r>
+        <w:rPr>
+          <w:rStyle w:val="VerbatimChar"/>
+        </w:rPr>
+        <w:t xml:space="preserve">        ...d,</w:t>
+      </w:r>
+      <w:r>
+        <w:br/>
+      </w:r>
+      <w:r>
+        <w:rPr>
+          <w:rStyle w:val="VerbatimChar"/>
+        </w:rPr>
+        <w:t xml:space="preserve">        selectedBikeMiles,</w:t>
+      </w:r>
+      <w:r>
+        <w:br/>
+      </w:r>
+      <w:r>
+        <w:rPr>
+          <w:rStyle w:val="VerbatimChar"/>
+        </w:rPr>
+        <w:t xml:space="preserve">        ratio</w:t>
+      </w:r>
+      <w:r>
+        <w:br/>
+      </w:r>
+      <w:r>
+        <w:rPr>
+          <w:rStyle w:val="VerbatimChar"/>
+        </w:rPr>
+        <w:t xml:space="preserve">      };</w:t>
+      </w:r>
+      <w:r>
+        <w:br/>
+      </w:r>
+      <w:r>
+        <w:rPr>
+          <w:rStyle w:val="VerbatimChar"/>
+        </w:rPr>
+        <w:t xml:space="preserve">    });</w:t>
+      </w:r>
+      <w:r>
+        <w:br/>
+      </w:r>
+      <w:r>
+        <w:br/>
+      </w:r>
+      <w:r>
+        <w:rPr>
+          <w:rStyle w:val="VerbatimChar"/>
+        </w:rPr>
+        <w:t xml:space="preserve">  const avgRatio = d3.mean(data, d =&gt; d.ratio);</w:t>
+      </w:r>
+      <w:r>
+        <w:br/>
+      </w:r>
+      <w:r>
+        <w:br/>
+      </w:r>
+      <w:r>
+        <w:rPr>
+          <w:rStyle w:val="VerbatimChar"/>
+        </w:rPr>
+        <w:t xml:space="preserve">  return data.map(d =&gt; ({</w:t>
       </w:r>
       <w:r>
         <w:br/>
@@ -9483,43 +9684,73 @@
         <w:rPr>
           <w:rStyle w:val="VerbatimChar"/>
         </w:rPr>
-        <w:t xml:space="preserve">    totalBike: totalBike,</w:t>
-      </w:r>
-      <w:r>
-        <w:br/>
-      </w:r>
-      <w:r>
-        <w:rPr>
-          <w:rStyle w:val="VerbatimChar"/>
-        </w:rPr>
-        <w:t xml:space="preserve">    // Calculate Density: Bike Miles per 100 Road Miles</w:t>
-      </w:r>
-      <w:r>
-        <w:br/>
-      </w:r>
-      <w:r>
-        <w:rPr>
-          <w:rStyle w:val="VerbatimChar"/>
-        </w:rPr>
-        <w:t xml:space="preserve">    density: roadMiles &gt; 0 ? (totalBike / roadMiles) * 100 : 0,</w:t>
-      </w:r>
-      <w:r>
-        <w:br/>
-      </w:r>
-      <w:r>
-        <w:rPr>
-          <w:rStyle w:val="VerbatimChar"/>
-        </w:rPr>
-        <w:t xml:space="preserve">    city: d.Name || "Unincorporated"</w:t>
-      </w:r>
-      <w:r>
-        <w:br/>
-      </w:r>
-      <w:r>
-        <w:rPr>
-          <w:rStyle w:val="VerbatimChar"/>
-        </w:rPr>
-        <w:t xml:space="preserve">  };</w:t>
+        <w:t xml:space="preserve">    avgRatio,</w:t>
+      </w:r>
+      <w:r>
+        <w:br/>
+      </w:r>
+      <w:r>
+        <w:rPr>
+          <w:rStyle w:val="VerbatimChar"/>
+        </w:rPr>
+        <w:t xml:space="preserve">    maturity: d.ratio &gt;= avgRatio ? "Above Average" : "Below Average"</w:t>
+      </w:r>
+      <w:r>
+        <w:br/>
+      </w:r>
+      <w:r>
+        <w:rPr>
+          <w:rStyle w:val="VerbatimChar"/>
+        </w:rPr>
+        <w:t xml:space="preserve">  }));</w:t>
+      </w:r>
+      <w:r>
+        <w:br/>
+      </w:r>
+      <w:r>
+        <w:rPr>
+          <w:rStyle w:val="VerbatimChar"/>
+        </w:rPr>
+        <w:t xml:space="preserve">}</w:t>
+      </w:r>
+      <w:r>
+        <w:br/>
+      </w:r>
+      <w:r>
+        <w:br/>
+      </w:r>
+      <w:r>
+        <w:rPr>
+          <w:rStyle w:val="VerbatimChar"/>
+        </w:rPr>
+        <w:t xml:space="preserve">// 4. Highlight Logic</w:t>
+      </w:r>
+      <w:r>
+        <w:br/>
+      </w:r>
+      <w:r>
+        <w:rPr>
+          <w:rStyle w:val="VerbatimChar"/>
+        </w:rPr>
+        <w:t xml:space="preserve">highlighted = processedData.filter(d =&gt; {</w:t>
+      </w:r>
+      <w:r>
+        <w:br/>
+      </w:r>
+      <w:r>
+        <w:rPr>
+          <w:rStyle w:val="VerbatimChar"/>
+        </w:rPr>
+        <w:t xml:space="preserve">  if (!searchCity || !d.Name) return false;</w:t>
+      </w:r>
+      <w:r>
+        <w:br/>
+      </w:r>
+      <w:r>
+        <w:rPr>
+          <w:rStyle w:val="VerbatimChar"/>
+        </w:rPr>
+        <w:t xml:space="preserve">  return d.Name.toLowerCase().includes(searchCity.toLowerCase());</w:t>
       </w:r>
       <w:r>
         <w:br/>
@@ -9540,115 +9771,7 @@
         <w:rPr>
           <w:rStyle w:val="VerbatimChar"/>
         </w:rPr>
-        <w:t xml:space="preserve">// 2. Interactive Inputs</w:t>
-      </w:r>
-      <w:r>
-        <w:br/>
-      </w:r>
-      <w:r>
-        <w:rPr>
-          <w:rStyle w:val="VerbatimChar"/>
-        </w:rPr>
-        <w:t xml:space="preserve">viewof metric = Inputs.radio(</w:t>
-      </w:r>
-      <w:r>
-        <w:br/>
-      </w:r>
-      <w:r>
-        <w:rPr>
-          <w:rStyle w:val="VerbatimChar"/>
-        </w:rPr>
-        <w:t xml:space="preserve">  new Map([</w:t>
-      </w:r>
-      <w:r>
-        <w:br/>
-      </w:r>
-      <w:r>
-        <w:rPr>
-          <w:rStyle w:val="VerbatimChar"/>
-        </w:rPr>
-        <w:t xml:space="preserve">    ["Total Bikeway Miles", "totalBike"],</w:t>
-      </w:r>
-      <w:r>
-        <w:br/>
-      </w:r>
-      <w:r>
-        <w:rPr>
-          <w:rStyle w:val="VerbatimChar"/>
-        </w:rPr>
-        <w:t xml:space="preserve">    ["Bikeway Density (Miles per 100 Road Miles)", "density"]</w:t>
-      </w:r>
-      <w:r>
-        <w:br/>
-      </w:r>
-      <w:r>
-        <w:rPr>
-          <w:rStyle w:val="VerbatimChar"/>
-        </w:rPr>
-        <w:t xml:space="preserve">  ]), </w:t>
-      </w:r>
-      <w:r>
-        <w:br/>
-      </w:r>
-      <w:r>
-        <w:rPr>
-          <w:rStyle w:val="VerbatimChar"/>
-        </w:rPr>
-        <w:t xml:space="preserve">  {value: "totalBike", label: "Rank by:"}</w:t>
-      </w:r>
-      <w:r>
-        <w:br/>
-      </w:r>
-      <w:r>
-        <w:rPr>
-          <w:rStyle w:val="VerbatimChar"/>
-        </w:rPr>
-        <w:t xml:space="preserve">)</w:t>
-      </w:r>
-      <w:r>
-        <w:br/>
-      </w:r>
-      <w:r>
-        <w:br/>
-      </w:r>
-      <w:r>
-        <w:rPr>
-          <w:rStyle w:val="VerbatimChar"/>
-        </w:rPr>
-        <w:t xml:space="preserve">viewof topN = Inputs.range([10, 50], {label: "Show Top X Cities", step: 5, value: 20})</w:t>
-      </w:r>
-      <w:r>
-        <w:br/>
-      </w:r>
-      <w:r>
-        <w:br/>
-      </w:r>
-      <w:r>
-        <w:rPr>
-          <w:rStyle w:val="VerbatimChar"/>
-        </w:rPr>
-        <w:t xml:space="preserve">// 3. Filter and Sort</w:t>
-      </w:r>
-      <w:r>
-        <w:br/>
-      </w:r>
-      <w:r>
-        <w:rPr>
-          <w:rStyle w:val="VerbatimChar"/>
-        </w:rPr>
-        <w:t xml:space="preserve">topData = d3.sort(processedData, (a, b) =&gt; d3.descending(a[metric], b[metric])).slice(0, topN)</w:t>
-      </w:r>
-      <w:r>
-        <w:br/>
-      </w:r>
-      <w:r>
-        <w:br/>
-      </w:r>
-      <w:r>
-        <w:rPr>
-          <w:rStyle w:val="VerbatimChar"/>
-        </w:rPr>
-        <w:t xml:space="preserve">// 4. Render Visualization</w:t>
+        <w:t xml:space="preserve">// 5. The Visualization</w:t>
       </w:r>
       <w:r>
         <w:br/>
@@ -9666,79 +9789,79 @@
         <w:rPr>
           <w:rStyle w:val="VerbatimChar"/>
         </w:rPr>
-        <w:t xml:space="preserve">  title: "Utah's Leading Municipalities in Bicycle Infrastructure",</w:t>
-      </w:r>
-      <w:r>
-        <w:br/>
-      </w:r>
-      <w:r>
-        <w:rPr>
-          <w:rStyle w:val="VerbatimChar"/>
-        </w:rPr>
-        <w:t xml:space="preserve">  subtitle: `Top ${topN} cities ranked by ${metric === 'totalBike' ? 'total mileage' : 'miles per 100 roadway miles'}.`,</w:t>
-      </w:r>
-      <w:r>
-        <w:br/>
-      </w:r>
-      <w:r>
-        <w:rPr>
-          <w:rStyle w:val="VerbatimChar"/>
-        </w:rPr>
-        <w:t xml:space="preserve">  marginLeft: 150,</w:t>
-      </w:r>
-      <w:r>
-        <w:br/>
-      </w:r>
-      <w:r>
-        <w:rPr>
-          <w:rStyle w:val="VerbatimChar"/>
-        </w:rPr>
-        <w:t xml:space="preserve">  marginRight: 50,</w:t>
-      </w:r>
-      <w:r>
-        <w:br/>
-      </w:r>
-      <w:r>
-        <w:rPr>
-          <w:rStyle w:val="VerbatimChar"/>
-        </w:rPr>
-        <w:t xml:space="preserve">  width: 800,</w:t>
-      </w:r>
-      <w:r>
-        <w:br/>
-      </w:r>
-      <w:r>
-        <w:rPr>
-          <w:rStyle w:val="VerbatimChar"/>
-        </w:rPr>
-        <w:t xml:space="preserve">  height: topN * 25,</w:t>
-      </w:r>
-      <w:r>
-        <w:br/>
-      </w:r>
-      <w:r>
-        <w:rPr>
-          <w:rStyle w:val="VerbatimChar"/>
-        </w:rPr>
-        <w:t xml:space="preserve">  x: { </w:t>
-      </w:r>
-      <w:r>
-        <w:br/>
-      </w:r>
-      <w:r>
-        <w:rPr>
-          <w:rStyle w:val="VerbatimChar"/>
-        </w:rPr>
-        <w:t xml:space="preserve">    grid: true, </w:t>
-      </w:r>
-      <w:r>
-        <w:br/>
-      </w:r>
-      <w:r>
-        <w:rPr>
-          <w:rStyle w:val="VerbatimChar"/>
-        </w:rPr>
-        <w:t xml:space="preserve">    label: metric === 'totalBike' ? "Total Miles →" : "Bike Miles / 100 Road Miles →" </w:t>
+        <w:t xml:space="preserve">  title: "Utah Bikeway Maturity Index",</w:t>
+      </w:r>
+      <w:r>
+        <w:br/>
+      </w:r>
+      <w:r>
+        <w:rPr>
+          <w:rStyle w:val="VerbatimChar"/>
+        </w:rPr>
+        <w:t xml:space="preserve">  subtitle: "Comparison of selected bikeway miles vs. total road network size.",</w:t>
+      </w:r>
+      <w:r>
+        <w:br/>
+      </w:r>
+      <w:r>
+        <w:rPr>
+          <w:rStyle w:val="VerbatimChar"/>
+        </w:rPr>
+        <w:t xml:space="preserve">  caption: "The dashed line represents the statewide average ratio for the selected infrastructure types.",</w:t>
+      </w:r>
+      <w:r>
+        <w:br/>
+      </w:r>
+      <w:r>
+        <w:rPr>
+          <w:rStyle w:val="VerbatimChar"/>
+        </w:rPr>
+        <w:t xml:space="preserve">  width: width,</w:t>
+      </w:r>
+      <w:r>
+        <w:br/>
+      </w:r>
+      <w:r>
+        <w:rPr>
+          <w:rStyle w:val="VerbatimChar"/>
+        </w:rPr>
+        <w:t xml:space="preserve">  height: 600,</w:t>
+      </w:r>
+      <w:r>
+        <w:br/>
+      </w:r>
+      <w:r>
+        <w:rPr>
+          <w:rStyle w:val="VerbatimChar"/>
+        </w:rPr>
+        <w:t xml:space="preserve">  grid: true,</w:t>
+      </w:r>
+      <w:r>
+        <w:br/>
+      </w:r>
+      <w:r>
+        <w:rPr>
+          <w:rStyle w:val="VerbatimChar"/>
+        </w:rPr>
+        <w:t xml:space="preserve">  style: {</w:t>
+      </w:r>
+      <w:r>
+        <w:br/>
+      </w:r>
+      <w:r>
+        <w:rPr>
+          <w:rStyle w:val="VerbatimChar"/>
+        </w:rPr>
+        <w:t xml:space="preserve">    fontSize: "12px",</w:t>
+      </w:r>
+      <w:r>
+        <w:br/>
+      </w:r>
+      <w:r>
+        <w:rPr>
+          <w:rStyle w:val="VerbatimChar"/>
+        </w:rPr>
+        <w:t xml:space="preserve">    fontFamily: "sans-serif"</w:t>
       </w:r>
       <w:r>
         <w:br/>
@@ -9756,7 +9879,25 @@
         <w:rPr>
           <w:rStyle w:val="VerbatimChar"/>
         </w:rPr>
-        <w:t xml:space="preserve">  y: { label: null },</w:t>
+        <w:t xml:space="preserve">  x: { label: "Total Road Miles (Log Scale) →", type: "log", domain: [10, 5000] },</w:t>
+      </w:r>
+      <w:r>
+        <w:br/>
+      </w:r>
+      <w:r>
+        <w:rPr>
+          <w:rStyle w:val="VerbatimChar"/>
+        </w:rPr>
+        <w:t xml:space="preserve">  y: { label: "Selected Bikeway Miles (Log Scale) →", type: "log", domain: [0.1, 500] },</w:t>
+      </w:r>
+      <w:r>
+        <w:br/>
+      </w:r>
+      <w:r>
+        <w:rPr>
+          <w:rStyle w:val="VerbatimChar"/>
+        </w:rPr>
+        <w:t xml:space="preserve">  style: { backgroundColor: 'transparent' },</w:t>
       </w:r>
       <w:r>
         <w:br/>
@@ -9774,16 +9915,16 @@
         <w:rPr>
           <w:rStyle w:val="VerbatimChar"/>
         </w:rPr>
-        <w:t xml:space="preserve">    domain: ["Paved Path", "Protected Bike Lane", "Bike Lane", "Marked Route", "Unmarked Route"],</w:t>
-      </w:r>
-      <w:r>
-        <w:br/>
-      </w:r>
-      <w:r>
-        <w:rPr>
-          <w:rStyle w:val="VerbatimChar"/>
-        </w:rPr>
-        <w:t xml:space="preserve">    range: ["#006d77", "#83c5be", "#e29578", "#ffddd2", "#9ca3af"], // Professional Teal/TerraCotta palette</w:t>
+        <w:t xml:space="preserve">    domain: ["Above Average", "Below Average"],</w:t>
+      </w:r>
+      <w:r>
+        <w:br/>
+      </w:r>
+      <w:r>
+        <w:rPr>
+          <w:rStyle w:val="VerbatimChar"/>
+        </w:rPr>
+        <w:t xml:space="preserve">    range: ["#008080", "#CD5C5C"],</w:t>
       </w:r>
       <w:r>
         <w:br/>
@@ -9819,313 +9960,442 @@
         <w:rPr>
           <w:rStyle w:val="VerbatimChar"/>
         </w:rPr>
-        <w:t xml:space="preserve">    // Background Road Mile Reference (Only for Total Miles view)</w:t>
-      </w:r>
-      <w:r>
-        <w:br/>
-      </w:r>
-      <w:r>
-        <w:rPr>
-          <w:rStyle w:val="VerbatimChar"/>
-        </w:rPr>
-        <w:t xml:space="preserve">    metric === "totalBike" </w:t>
-      </w:r>
-      <w:r>
-        <w:br/>
-      </w:r>
-      <w:r>
-        <w:rPr>
-          <w:rStyle w:val="VerbatimChar"/>
-        </w:rPr>
-        <w:t xml:space="preserve">      ? Plot.ruleY(topData, {y: "city", x1: 0, x2: "All Roads", stroke: "#e5e7eb", strokeWidth: 8, strokeLinecap: "round"})</w:t>
-      </w:r>
-      <w:r>
-        <w:br/>
-      </w:r>
-      <w:r>
-        <w:rPr>
-          <w:rStyle w:val="VerbatimChar"/>
-        </w:rPr>
-        <w:t xml:space="preserve">      : null,</w:t>
-      </w:r>
-      <w:r>
-        <w:br/>
-      </w:r>
-      <w:r>
-        <w:rPr>
-          <w:rStyle w:val="VerbatimChar"/>
-        </w:rPr>
-        <w:t xml:space="preserve">    </w:t>
-      </w:r>
-      <w:r>
-        <w:br/>
-      </w:r>
-      <w:r>
-        <w:rPr>
-          <w:rStyle w:val="VerbatimChar"/>
-        </w:rPr>
-        <w:t xml:space="preserve">    // Lollipop Stems</w:t>
-      </w:r>
-      <w:r>
-        <w:br/>
-      </w:r>
-      <w:r>
-        <w:rPr>
-          <w:rStyle w:val="VerbatimChar"/>
-        </w:rPr>
-        <w:t xml:space="preserve">    Plot.ruleY(topData, {y: "city", x: metric, stroke: "#374151", strokeWidth: 1}),</w:t>
-      </w:r>
-      <w:r>
-        <w:br/>
-      </w:r>
-      <w:r>
-        <w:rPr>
-          <w:rStyle w:val="VerbatimChar"/>
-        </w:rPr>
-        <w:t xml:space="preserve">    </w:t>
-      </w:r>
-      <w:r>
-        <w:br/>
-      </w:r>
-      <w:r>
-        <w:rPr>
-          <w:rStyle w:val="VerbatimChar"/>
-        </w:rPr>
-        <w:t xml:space="preserve">    // Stacked Segmented Lollipops (The "Candy")</w:t>
-      </w:r>
-      <w:r>
-        <w:br/>
-      </w:r>
-      <w:r>
-        <w:rPr>
-          <w:rStyle w:val="VerbatimChar"/>
-        </w:rPr>
-        <w:t xml:space="preserve">    Plot.dotX(</w:t>
-      </w:r>
-      <w:r>
-        <w:br/>
-      </w:r>
-      <w:r>
-        <w:rPr>
-          <w:rStyle w:val="VerbatimChar"/>
-        </w:rPr>
-        <w:t xml:space="preserve">      topData.flatMap(d =&gt; {</w:t>
-      </w:r>
-      <w:r>
-        <w:br/>
-      </w:r>
-      <w:r>
-        <w:rPr>
-          <w:rStyle w:val="VerbatimChar"/>
-        </w:rPr>
-        <w:t xml:space="preserve">        const cats = ["Paved Path", "Protected Bike Lane", "Bike Lane", "Marked Route", "Unmarked Route"];</w:t>
-      </w:r>
-      <w:r>
-        <w:br/>
-      </w:r>
-      <w:r>
-        <w:rPr>
-          <w:rStyle w:val="VerbatimChar"/>
-        </w:rPr>
-        <w:t xml:space="preserve">        let currentX = 0;</w:t>
-      </w:r>
-      <w:r>
-        <w:br/>
-      </w:r>
-      <w:r>
-        <w:rPr>
-          <w:rStyle w:val="VerbatimChar"/>
-        </w:rPr>
-        <w:t xml:space="preserve">        return cats.map(cat =&gt; {</w:t>
-      </w:r>
-      <w:r>
-        <w:br/>
-      </w:r>
-      <w:r>
-        <w:rPr>
-          <w:rStyle w:val="VerbatimChar"/>
-        </w:rPr>
-        <w:t xml:space="preserve">          const val = metric === "totalBike" ? d[cat] : (d[cat] / d["All Roads"]) * 100;</w:t>
-      </w:r>
-      <w:r>
-        <w:br/>
-      </w:r>
-      <w:r>
-        <w:rPr>
-          <w:rStyle w:val="VerbatimChar"/>
-        </w:rPr>
-        <w:t xml:space="preserve">          currentX += val;</w:t>
-      </w:r>
-      <w:r>
-        <w:br/>
-      </w:r>
-      <w:r>
-        <w:rPr>
-          <w:rStyle w:val="VerbatimChar"/>
-        </w:rPr>
-        <w:t xml:space="preserve">          return { city: d.city, type: cat, value: currentX, individual: val };</w:t>
-      </w:r>
-      <w:r>
-        <w:br/>
-      </w:r>
-      <w:r>
-        <w:rPr>
-          <w:rStyle w:val="VerbatimChar"/>
-        </w:rPr>
-        <w:t xml:space="preserve">        }).filter(v =&gt; v.individual &gt; 0);</w:t>
-      </w:r>
-      <w:r>
-        <w:br/>
-      </w:r>
-      <w:r>
-        <w:rPr>
-          <w:rStyle w:val="VerbatimChar"/>
-        </w:rPr>
-        <w:t xml:space="preserve">      }), </w:t>
-      </w:r>
-      <w:r>
-        <w:br/>
-      </w:r>
-      <w:r>
-        <w:rPr>
-          <w:rStyle w:val="VerbatimChar"/>
-        </w:rPr>
-        <w:t xml:space="preserve">      {</w:t>
-      </w:r>
-      <w:r>
-        <w:br/>
-      </w:r>
-      <w:r>
-        <w:rPr>
-          <w:rStyle w:val="VerbatimChar"/>
-        </w:rPr>
-        <w:t xml:space="preserve">        x: "value", </w:t>
-      </w:r>
-      <w:r>
-        <w:br/>
-      </w:r>
-      <w:r>
-        <w:rPr>
-          <w:rStyle w:val="VerbatimChar"/>
-        </w:rPr>
-        <w:t xml:space="preserve">        y: "city", </w:t>
-      </w:r>
-      <w:r>
-        <w:br/>
-      </w:r>
-      <w:r>
-        <w:rPr>
-          <w:rStyle w:val="VerbatimChar"/>
-        </w:rPr>
-        <w:t xml:space="preserve">        fill: "type", </w:t>
-      </w:r>
-      <w:r>
-        <w:br/>
-      </w:r>
-      <w:r>
-        <w:rPr>
-          <w:rStyle w:val="VerbatimChar"/>
-        </w:rPr>
-        <w:t xml:space="preserve">        r: 6,</w:t>
-      </w:r>
-      <w:r>
-        <w:br/>
-      </w:r>
-      <w:r>
-        <w:rPr>
-          <w:rStyle w:val="VerbatimChar"/>
-        </w:rPr>
-        <w:t xml:space="preserve">        stroke: "white",</w:t>
-      </w:r>
-      <w:r>
-        <w:br/>
-      </w:r>
-      <w:r>
-        <w:rPr>
-          <w:rStyle w:val="VerbatimChar"/>
-        </w:rPr>
-        <w:t xml:space="preserve">        title: d =&gt; `${d.city}\n${d.type}: ${d.individual.toFixed(2)}`</w:t>
-      </w:r>
-      <w:r>
-        <w:br/>
-      </w:r>
-      <w:r>
-        <w:rPr>
-          <w:rStyle w:val="VerbatimChar"/>
-        </w:rPr>
-        <w:t xml:space="preserve">      }</w:t>
-      </w:r>
-      <w:r>
-        <w:br/>
-      </w:r>
-      <w:r>
-        <w:rPr>
-          <w:rStyle w:val="VerbatimChar"/>
-        </w:rPr>
-        <w:t xml:space="preserve">    ),</w:t>
-      </w:r>
-      <w:r>
-        <w:br/>
-      </w:r>
-      <w:r>
-        <w:rPr>
-          <w:rStyle w:val="VerbatimChar"/>
-        </w:rPr>
-        <w:t xml:space="preserve">    </w:t>
-      </w:r>
-      <w:r>
-        <w:br/>
-      </w:r>
-      <w:r>
-        <w:rPr>
-          <w:rStyle w:val="VerbatimChar"/>
-        </w:rPr>
-        <w:t xml:space="preserve">    // Labels for the end of the bars</w:t>
-      </w:r>
-      <w:r>
-        <w:br/>
-      </w:r>
-      <w:r>
-        <w:rPr>
-          <w:rStyle w:val="VerbatimChar"/>
-        </w:rPr>
-        <w:t xml:space="preserve">    Plot.text(topData, {</w:t>
-      </w:r>
-      <w:r>
-        <w:br/>
-      </w:r>
-      <w:r>
-        <w:rPr>
-          <w:rStyle w:val="VerbatimChar"/>
-        </w:rPr>
-        <w:t xml:space="preserve">      x: metric,</w:t>
-      </w:r>
-      <w:r>
-        <w:br/>
-      </w:r>
-      <w:r>
-        <w:rPr>
-          <w:rStyle w:val="VerbatimChar"/>
-        </w:rPr>
-        <w:t xml:space="preserve">      y: "city",</w:t>
-      </w:r>
-      <w:r>
-        <w:br/>
-      </w:r>
-      <w:r>
-        <w:rPr>
-          <w:rStyle w:val="VerbatimChar"/>
-        </w:rPr>
-        <w:t xml:space="preserve">      text: d =&gt; d[metric].toFixed(1),</w:t>
-      </w:r>
-      <w:r>
-        <w:br/>
-      </w:r>
-      <w:r>
-        <w:rPr>
-          <w:rStyle w:val="VerbatimChar"/>
-        </w:rPr>
-        <w:t xml:space="preserve">      dx: 25,</w:t>
+        <w:t xml:space="preserve">    // Average Maturity Benchmark Line</w:t>
+      </w:r>
+      <w:r>
+        <w:br/>
+      </w:r>
+      <w:r>
+        <w:rPr>
+          <w:rStyle w:val="VerbatimChar"/>
+        </w:rPr>
+        <w:t xml:space="preserve">    Plot.line(d3.range(10, 5000, 100), {</w:t>
+      </w:r>
+      <w:r>
+        <w:br/>
+      </w:r>
+      <w:r>
+        <w:rPr>
+          <w:rStyle w:val="VerbatimChar"/>
+        </w:rPr>
+        <w:t xml:space="preserve">      x: d =&gt; d,</w:t>
+      </w:r>
+      <w:r>
+        <w:br/>
+      </w:r>
+      <w:r>
+        <w:rPr>
+          <w:rStyle w:val="VerbatimChar"/>
+        </w:rPr>
+        <w:t xml:space="preserve">      y: d =&gt; d * (processedData[0].avgRatio / 100),</w:t>
+      </w:r>
+      <w:r>
+        <w:br/>
+      </w:r>
+      <w:r>
+        <w:rPr>
+          <w:rStyle w:val="VerbatimChar"/>
+        </w:rPr>
+        <w:t xml:space="preserve">      stroke: "#444",</w:t>
+      </w:r>
+      <w:r>
+        <w:br/>
+      </w:r>
+      <w:r>
+        <w:rPr>
+          <w:rStyle w:val="VerbatimChar"/>
+        </w:rPr>
+        <w:t xml:space="preserve">      strokeDasharray: "4,4",</w:t>
+      </w:r>
+      <w:r>
+        <w:br/>
+      </w:r>
+      <w:r>
+        <w:rPr>
+          <w:rStyle w:val="VerbatimChar"/>
+        </w:rPr>
+        <w:t xml:space="preserve">      strokeWidth: 1,</w:t>
+      </w:r>
+      <w:r>
+        <w:br/>
+      </w:r>
+      <w:r>
+        <w:rPr>
+          <w:rStyle w:val="VerbatimChar"/>
+        </w:rPr>
+        <w:t xml:space="preserve">      opacity: 0.4</w:t>
+      </w:r>
+      <w:r>
+        <w:br/>
+      </w:r>
+      <w:r>
+        <w:rPr>
+          <w:rStyle w:val="VerbatimChar"/>
+        </w:rPr>
+        <w:t xml:space="preserve">    }),</w:t>
+      </w:r>
+      <w:r>
+        <w:br/>
+      </w:r>
+      <w:r>
+        <w:br/>
+      </w:r>
+      <w:r>
+        <w:rPr>
+          <w:rStyle w:val="VerbatimChar"/>
+        </w:rPr>
+        <w:t xml:space="preserve">    // Data Points</w:t>
+      </w:r>
+      <w:r>
+        <w:br/>
+      </w:r>
+      <w:r>
+        <w:rPr>
+          <w:rStyle w:val="VerbatimChar"/>
+        </w:rPr>
+        <w:t xml:space="preserve">    Plot.dot(processedData, {</w:t>
+      </w:r>
+      <w:r>
+        <w:br/>
+      </w:r>
+      <w:r>
+        <w:rPr>
+          <w:rStyle w:val="VerbatimChar"/>
+        </w:rPr>
+        <w:t xml:space="preserve">      x: "All Roads",</w:t>
+      </w:r>
+      <w:r>
+        <w:br/>
+      </w:r>
+      <w:r>
+        <w:rPr>
+          <w:rStyle w:val="VerbatimChar"/>
+        </w:rPr>
+        <w:t xml:space="preserve">      y: "selectedBikeMiles",</w:t>
+      </w:r>
+      <w:r>
+        <w:br/>
+      </w:r>
+      <w:r>
+        <w:rPr>
+          <w:rStyle w:val="VerbatimChar"/>
+        </w:rPr>
+        <w:t xml:space="preserve">      stroke: "maturity",</w:t>
+      </w:r>
+      <w:r>
+        <w:br/>
+      </w:r>
+      <w:r>
+        <w:rPr>
+          <w:rStyle w:val="VerbatimChar"/>
+        </w:rPr>
+        <w:t xml:space="preserve">      fill: "maturity",</w:t>
+      </w:r>
+      <w:r>
+        <w:br/>
+      </w:r>
+      <w:r>
+        <w:rPr>
+          <w:rStyle w:val="VerbatimChar"/>
+        </w:rPr>
+        <w:t xml:space="preserve">      fillOpacity: 0.3,</w:t>
+      </w:r>
+      <w:r>
+        <w:br/>
+      </w:r>
+      <w:r>
+        <w:rPr>
+          <w:rStyle w:val="VerbatimChar"/>
+        </w:rPr>
+        <w:t xml:space="preserve">      r: 4,</w:t>
+      </w:r>
+      <w:r>
+        <w:br/>
+      </w:r>
+      <w:r>
+        <w:rPr>
+          <w:rStyle w:val="VerbatimChar"/>
+        </w:rPr>
+        <w:t xml:space="preserve">      tip: true,</w:t>
+      </w:r>
+      <w:r>
+        <w:br/>
+      </w:r>
+      <w:r>
+        <w:rPr>
+          <w:rStyle w:val="VerbatimChar"/>
+        </w:rPr>
+        <w:t xml:space="preserve">      title: d =&gt; `${d.Name}\nBikeway: ${d.selectedBikeMiles.toFixed(1)} mi\nRoadway: ${d["All Roads"]} mi\nRatio: ${d.ratio.toFixed(1)}%`</w:t>
+      </w:r>
+      <w:r>
+        <w:br/>
+      </w:r>
+      <w:r>
+        <w:rPr>
+          <w:rStyle w:val="VerbatimChar"/>
+        </w:rPr>
+        <w:t xml:space="preserve">    }),</w:t>
+      </w:r>
+      <w:r>
+        <w:br/>
+      </w:r>
+      <w:r>
+        <w:br/>
+      </w:r>
+      <w:r>
+        <w:rPr>
+          <w:rStyle w:val="VerbatimChar"/>
+        </w:rPr>
+        <w:t xml:space="preserve">    // Highlight the Selected City</w:t>
+      </w:r>
+      <w:r>
+        <w:br/>
+      </w:r>
+      <w:r>
+        <w:rPr>
+          <w:rStyle w:val="VerbatimChar"/>
+        </w:rPr>
+        <w:t xml:space="preserve">    Plot.dot(highlighted, {</w:t>
+      </w:r>
+      <w:r>
+        <w:br/>
+      </w:r>
+      <w:r>
+        <w:rPr>
+          <w:rStyle w:val="VerbatimChar"/>
+        </w:rPr>
+        <w:t xml:space="preserve">      x: "All Roads",</w:t>
+      </w:r>
+      <w:r>
+        <w:br/>
+      </w:r>
+      <w:r>
+        <w:rPr>
+          <w:rStyle w:val="VerbatimChar"/>
+        </w:rPr>
+        <w:t xml:space="preserve">      y: "selectedBikeMiles",</w:t>
+      </w:r>
+      <w:r>
+        <w:br/>
+      </w:r>
+      <w:r>
+        <w:rPr>
+          <w:rStyle w:val="VerbatimChar"/>
+        </w:rPr>
+        <w:t xml:space="preserve">      stroke: "black",</w:t>
+      </w:r>
+      <w:r>
+        <w:br/>
+      </w:r>
+      <w:r>
+        <w:rPr>
+          <w:rStyle w:val="VerbatimChar"/>
+        </w:rPr>
+        <w:t xml:space="preserve">      strokeWidth: 2,</w:t>
+      </w:r>
+      <w:r>
+        <w:br/>
+      </w:r>
+      <w:r>
+        <w:rPr>
+          <w:rStyle w:val="VerbatimChar"/>
+        </w:rPr>
+        <w:t xml:space="preserve">      r: 8</w:t>
+      </w:r>
+      <w:r>
+        <w:br/>
+      </w:r>
+      <w:r>
+        <w:rPr>
+          <w:rStyle w:val="VerbatimChar"/>
+        </w:rPr>
+        <w:t xml:space="preserve">    }),</w:t>
+      </w:r>
+      <w:r>
+        <w:br/>
+      </w:r>
+      <w:r>
+        <w:br/>
+      </w:r>
+      <w:r>
+        <w:rPr>
+          <w:rStyle w:val="VerbatimChar"/>
+        </w:rPr>
+        <w:t xml:space="preserve">    // FIXED LABEL: Explicit dark fill with white halo</w:t>
+      </w:r>
+      <w:r>
+        <w:br/>
+      </w:r>
+      <w:r>
+        <w:rPr>
+          <w:rStyle w:val="VerbatimChar"/>
+        </w:rPr>
+        <w:t xml:space="preserve">    Plot.text(highlighted, {</w:t>
+      </w:r>
+      <w:r>
+        <w:br/>
+      </w:r>
+      <w:r>
+        <w:rPr>
+          <w:rStyle w:val="VerbatimChar"/>
+        </w:rPr>
+        <w:t xml:space="preserve">      x: "All Roads",</w:t>
+      </w:r>
+      <w:r>
+        <w:br/>
+      </w:r>
+      <w:r>
+        <w:rPr>
+          <w:rStyle w:val="VerbatimChar"/>
+        </w:rPr>
+        <w:t xml:space="preserve">      y: "selectedBikeMiles",</w:t>
+      </w:r>
+      <w:r>
+        <w:br/>
+      </w:r>
+      <w:r>
+        <w:rPr>
+          <w:rStyle w:val="VerbatimChar"/>
+        </w:rPr>
+        <w:t xml:space="preserve">      text: "Name",</w:t>
+      </w:r>
+      <w:r>
+        <w:br/>
+      </w:r>
+      <w:r>
+        <w:rPr>
+          <w:rStyle w:val="VerbatimChar"/>
+        </w:rPr>
+        <w:t xml:space="preserve">      dy: -20,</w:t>
+      </w:r>
+      <w:r>
+        <w:br/>
+      </w:r>
+      <w:r>
+        <w:rPr>
+          <w:rStyle w:val="VerbatimChar"/>
+        </w:rPr>
+        <w:t xml:space="preserve">      fontWeight: "bold",</w:t>
+      </w:r>
+      <w:r>
+        <w:br/>
+      </w:r>
+      <w:r>
+        <w:rPr>
+          <w:rStyle w:val="VerbatimChar"/>
+        </w:rPr>
+        <w:t xml:space="preserve">      fontSize: 14,</w:t>
+      </w:r>
+      <w:r>
+        <w:br/>
+      </w:r>
+      <w:r>
+        <w:rPr>
+          <w:rStyle w:val="VerbatimChar"/>
+        </w:rPr>
+        <w:t xml:space="preserve">      fill: "#333", // Explicit dark charcoal</w:t>
+      </w:r>
+      <w:r>
+        <w:br/>
+      </w:r>
+      <w:r>
+        <w:rPr>
+          <w:rStyle w:val="VerbatimChar"/>
+        </w:rPr>
+        <w:t xml:space="preserve">      stroke: "white", // White halo</w:t>
+      </w:r>
+      <w:r>
+        <w:br/>
+      </w:r>
+      <w:r>
+        <w:rPr>
+          <w:rStyle w:val="VerbatimChar"/>
+        </w:rPr>
+        <w:t xml:space="preserve">      strokeWidth: 4,  // Thick enough to be seen</w:t>
+      </w:r>
+      <w:r>
+        <w:br/>
+      </w:r>
+      <w:r>
+        <w:rPr>
+          <w:rStyle w:val="VerbatimChar"/>
+        </w:rPr>
+        <w:t xml:space="preserve">      paintOrder: "stroke"</w:t>
+      </w:r>
+      <w:r>
+        <w:br/>
+      </w:r>
+      <w:r>
+        <w:rPr>
+          <w:rStyle w:val="VerbatimChar"/>
+        </w:rPr>
+        <w:t xml:space="preserve">    }),</w:t>
+      </w:r>
+      <w:r>
+        <w:br/>
+      </w:r>
+      <w:r>
+        <w:br/>
+      </w:r>
+      <w:r>
+        <w:rPr>
+          <w:rStyle w:val="VerbatimChar"/>
+        </w:rPr>
+        <w:t xml:space="preserve">    // Auto-label high performers</w:t>
+      </w:r>
+      <w:r>
+        <w:br/>
+      </w:r>
+      <w:r>
+        <w:rPr>
+          <w:rStyle w:val="VerbatimChar"/>
+        </w:rPr>
+        <w:t xml:space="preserve">    Plot.text(processedData, {</w:t>
+      </w:r>
+      <w:r>
+        <w:br/>
+      </w:r>
+      <w:r>
+        <w:rPr>
+          <w:rStyle w:val="VerbatimChar"/>
+        </w:rPr>
+        <w:t xml:space="preserve">      filter: d =&gt; (d.ratio &gt; processedData[0].avgRatio * 3 &amp;&amp; d["All Roads"] &gt; 100) || d.selectedBikeMiles &gt; 120,</w:t>
+      </w:r>
+      <w:r>
+        <w:br/>
+      </w:r>
+      <w:r>
+        <w:rPr>
+          <w:rStyle w:val="VerbatimChar"/>
+        </w:rPr>
+        <w:t xml:space="preserve">      x: "All Roads",</w:t>
+      </w:r>
+      <w:r>
+        <w:br/>
+      </w:r>
+      <w:r>
+        <w:rPr>
+          <w:rStyle w:val="VerbatimChar"/>
+        </w:rPr>
+        <w:t xml:space="preserve">      y: "selectedBikeMiles",</w:t>
+      </w:r>
+      <w:r>
+        <w:br/>
+      </w:r>
+      <w:r>
+        <w:rPr>
+          <w:rStyle w:val="VerbatimChar"/>
+        </w:rPr>
+        <w:t xml:space="preserve">      text: "Name",</w:t>
+      </w:r>
+      <w:r>
+        <w:br/>
+      </w:r>
+      <w:r>
+        <w:rPr>
+          <w:rStyle w:val="VerbatimChar"/>
+        </w:rPr>
+        <w:t xml:space="preserve">      dy: -10,</w:t>
       </w:r>
       <w:r>
         <w:br/>
@@ -10143,7 +10413,16 @@
         <w:rPr>
           <w:rStyle w:val="VerbatimChar"/>
         </w:rPr>
-        <w:t xml:space="preserve">      fontWeight: "bold"</w:t>
+        <w:t xml:space="preserve">      fill: "#555",</w:t>
+      </w:r>
+      <w:r>
+        <w:br/>
+      </w:r>
+      <w:r>
+        <w:rPr>
+          <w:rStyle w:val="VerbatimChar"/>
+        </w:rPr>
+        <w:t xml:space="preserve">      opacity: 0.8</w:t>
       </w:r>
       <w:r>
         <w:br/>

</xml_diff>